<commit_message>
Simplify midterm report narrative and schema visuals
</commit_message>
<xml_diff>
--- a/docs/defense/docx/3_Sinif_Proje_Raporu_YAZILIM_KTUN_EN.docx
+++ b/docs/defense/docx/3_Sinif_Proje_Raporu_YAZILIM_KTUN_EN.docx
@@ -129,16 +129,7 @@
     </w:p>
     <w:p>
       <w:r>
-        <w:t xml:space="preserve">The most important aspect of these outputs is that they do not exist as disconnected modules. They operate as a single flow centered on a shared data model. Papers found on the crawler side are transferred into the Supabase-based storage and database layer, the annotator interface presents these papers to the user, user actions are recorded as label events, and these labels are then converted by </w:t>
-      </w:r>
-      <w:r>
-        <w:rPr>
-          <w:rFonts w:ascii="Courier New" w:hAnsi="Courier New" w:eastAsia="Courier New"/>
-        </w:rPr>
-        <w:t>feedback/update_terms.py</w:t>
-      </w:r>
-      <w:r>
-        <w:t xml:space="preserve"> into new feedback terms that improve later crawler queries and ranking scores.</w:t>
+        <w:t>These outputs do not exist as disconnected modules. The core project idea is simple: the system first finds promising papers, the expert user reviews them and enters structured data, and those user decisions then improve the next search cycle. By the midterm stage, the core pieces of that loop are already working together.</w:t>
       </w:r>
     </w:p>
     <w:p>
@@ -320,194 +311,12 @@
     </w:tbl>
     <w:p>
       <w:r>
-        <w:t>At the system level, the work completed during the term clusters around three main axes.</w:t>
+        <w:t>The system can be explained through four main ideas. First, the crawler should not send random papers into the system; it should choose stronger candidates first. Second, both the UI and the crawler should work on the same backend and data model. Third, the expert user needs an annotation screen that supports real work on top of the PDF itself. Fourth, user decisions should not remain a passive record; they should become feedback for later search and ranking.</w:t>
       </w:r>
     </w:p>
     <w:p>
       <w:r>
-        <w:t xml:space="preserve">The first axis is data acquisition and candidate-paper stock creation. The crawler initially focused on Europe PMC, but it was later refactored into a source-agnostic </w:t>
-      </w:r>
-      <w:r>
-        <w:rPr>
-          <w:rFonts w:ascii="Courier New" w:hAnsi="Courier New" w:eastAsia="Courier New"/>
-        </w:rPr>
-        <w:t>Search -&gt; Filter -&gt; Acquisition</w:t>
-      </w:r>
-      <w:r>
-        <w:t xml:space="preserve"> architecture. This means a paper is now evaluated before any PDF download takes place, using signals such as title, abstract, language, source bias, food/nutrient matches, unit patterns, embedding similarity, and learned feedback terms. This approach reduces unnecessary PDF downloads and helps place more relevant candidates into the annotator queue.</w:t>
-      </w:r>
-    </w:p>
-    <w:p>
-      <w:r>
-        <w:t xml:space="preserve">The second axis is the shared backend and data model. When </w:t>
-      </w:r>
-      <w:r>
-        <w:rPr>
-          <w:rFonts w:ascii="Courier New" w:hAnsi="Courier New" w:eastAsia="Courier New"/>
-        </w:rPr>
-        <w:t>papers</w:t>
-      </w:r>
-      <w:r>
-        <w:t xml:space="preserve">, </w:t>
-      </w:r>
-      <w:r>
-        <w:rPr>
-          <w:rFonts w:ascii="Courier New" w:hAnsi="Courier New" w:eastAsia="Courier New"/>
-        </w:rPr>
-        <w:t>annotations</w:t>
-      </w:r>
-      <w:r>
-        <w:t xml:space="preserve">, </w:t>
-      </w:r>
-      <w:r>
-        <w:rPr>
-          <w:rFonts w:ascii="Courier New" w:hAnsi="Courier New" w:eastAsia="Courier New"/>
-        </w:rPr>
-        <w:t>food_items</w:t>
-      </w:r>
-      <w:r>
-        <w:t xml:space="preserve">, </w:t>
-      </w:r>
-      <w:r>
-        <w:rPr>
-          <w:rFonts w:ascii="Courier New" w:hAnsi="Courier New" w:eastAsia="Courier New"/>
-        </w:rPr>
-        <w:t>annotation_nutrient_values</w:t>
-      </w:r>
-      <w:r>
-        <w:t xml:space="preserve">, </w:t>
-      </w:r>
-      <w:r>
-        <w:rPr>
-          <w:rFonts w:ascii="Courier New" w:hAnsi="Courier New" w:eastAsia="Courier New"/>
-        </w:rPr>
-        <w:t>paper_label_events</w:t>
-      </w:r>
-      <w:r>
-        <w:t xml:space="preserve">, </w:t>
-      </w:r>
-      <w:r>
-        <w:rPr>
-          <w:rFonts w:ascii="Courier New" w:hAnsi="Courier New" w:eastAsia="Courier New"/>
-        </w:rPr>
-        <w:t>paper_global_labels</w:t>
-      </w:r>
-      <w:r>
-        <w:t xml:space="preserve">, </w:t>
-      </w:r>
-      <w:r>
-        <w:rPr>
-          <w:rFonts w:ascii="Courier New" w:hAnsi="Courier New" w:eastAsia="Courier New"/>
-        </w:rPr>
-        <w:t>paper_search_hits</w:t>
-      </w:r>
-      <w:r>
-        <w:t xml:space="preserve">, </w:t>
-      </w:r>
-      <w:r>
-        <w:rPr>
-          <w:rFonts w:ascii="Courier New" w:hAnsi="Courier New" w:eastAsia="Courier New"/>
-        </w:rPr>
-        <w:t>paper_search_batches</w:t>
-      </w:r>
-      <w:r>
-        <w:t xml:space="preserve">, and </w:t>
-      </w:r>
-      <w:r>
-        <w:rPr>
-          <w:rFonts w:ascii="Courier New" w:hAnsi="Courier New" w:eastAsia="Courier New"/>
-        </w:rPr>
-        <w:t>paper_search_batch_hits</w:t>
-      </w:r>
-      <w:r>
-        <w:t xml:space="preserve"> are considered together, the system stores not only final user data but also how a paper was discovered and why it was accepted or rejected. This decision makes the system easier to evaluate technically and also creates the infrastructure needed for later experimental comparisons.</w:t>
-      </w:r>
-    </w:p>
-    <w:p>
-      <w:r>
-        <w:t xml:space="preserve">The third axis is the expert annotation interface. The React/Vite annotator is no longer just a simple form. It has become a real working environment that includes PDF rendering, nutrient highlighting inside the text layer, quick nutrient insertion from highlights, ranked food and nutrient lookup, test mode, a global "definitely no data" flow, and user-action event logging. The changes in </w:t>
-      </w:r>
-      <w:r>
-        <w:rPr>
-          <w:rFonts w:ascii="Courier New" w:hAnsi="Courier New" w:eastAsia="Courier New"/>
-        </w:rPr>
-        <w:t>Annotate.jsx</w:t>
-      </w:r>
-      <w:r>
-        <w:t xml:space="preserve">, </w:t>
-      </w:r>
-      <w:r>
-        <w:rPr>
-          <w:rFonts w:ascii="Courier New" w:hAnsi="Courier New" w:eastAsia="Courier New"/>
-        </w:rPr>
-        <w:t>PdfViewer.jsx</w:t>
-      </w:r>
-      <w:r>
-        <w:t xml:space="preserve">, and </w:t>
-      </w:r>
-      <w:r>
-        <w:rPr>
-          <w:rFonts w:ascii="Courier New" w:hAnsi="Courier New" w:eastAsia="Courier New"/>
-        </w:rPr>
-        <w:t>PdfTextScanner.js</w:t>
-      </w:r>
-      <w:r>
-        <w:t xml:space="preserve"> show that the user-facing side of the project has moved from research prototype level toward a usable tool.</w:t>
-      </w:r>
-    </w:p>
-    <w:p>
-      <w:r>
-        <w:t xml:space="preserve">The term also included quality and consistency fixes, not only new features. For example, only valid food items are now counted and saved so that empty placeholder cards do not create incorrect totals. Likewise, the </w:t>
-      </w:r>
-      <w:r>
-        <w:rPr>
-          <w:rFonts w:ascii="Courier New" w:hAnsi="Courier New" w:eastAsia="Courier New"/>
-        </w:rPr>
-        <w:t>food_item_count</w:t>
-      </w:r>
-      <w:r>
-        <w:t xml:space="preserve"> and </w:t>
-      </w:r>
-      <w:r>
-        <w:rPr>
-          <w:rFonts w:ascii="Courier New" w:hAnsi="Courier New" w:eastAsia="Courier New"/>
-        </w:rPr>
-        <w:t>nutrient_value_count</w:t>
-      </w:r>
-      <w:r>
-        <w:t xml:space="preserve"> fields stored in </w:t>
-      </w:r>
-      <w:r>
-        <w:rPr>
-          <w:rFonts w:ascii="Courier New" w:hAnsi="Courier New" w:eastAsia="Courier New"/>
-        </w:rPr>
-        <w:t>paper_label_events</w:t>
-      </w:r>
-      <w:r>
-        <w:t xml:space="preserve"> now reflect actual user output more accurately. On the crawler side, dropping the legacy </w:t>
-      </w:r>
-      <w:r>
-        <w:rPr>
-          <w:rFonts w:ascii="Courier New" w:hAnsi="Courier New" w:eastAsia="Courier New"/>
-        </w:rPr>
-        <w:t>seen_ids</w:t>
-      </w:r>
-      <w:r>
-        <w:t xml:space="preserve"> logic in favor of </w:t>
-      </w:r>
-      <w:r>
-        <w:rPr>
-          <w:rFonts w:ascii="Courier New" w:hAnsi="Courier New" w:eastAsia="Courier New"/>
-        </w:rPr>
-        <w:t>paper_states</w:t>
-      </w:r>
-      <w:r>
-        <w:t xml:space="preserve"> also improves reproducibility and control over repeated runs.</w:t>
-      </w:r>
-    </w:p>
-    <w:p>
-      <w:r>
-        <w:t>Table 2 lists the high-impact developments that were added to the repository after the handoff snapshot.</w:t>
+        <w:t>For that reason, the report focuses on the working system idea rather than the commit-by-commit sequence. Table 2 is therefore organized around the main system parts instead of dates.</w:t>
       </w:r>
     </w:p>
     <w:tbl>
@@ -528,7 +337,7 @@
           </w:tcPr>
           <w:p>
             <w:r>
-              <w:t>Date</w:t>
+              <w:t>Layer</w:t>
             </w:r>
           </w:p>
         </w:tc>
@@ -538,7 +347,7 @@
           </w:tcPr>
           <w:p>
             <w:r>
-              <w:t>High-impact development</w:t>
+              <w:t>Work completed</w:t>
             </w:r>
           </w:p>
         </w:tc>
@@ -548,7 +357,7 @@
           </w:tcPr>
           <w:p>
             <w:r>
-              <w:t>Project impact</w:t>
+              <w:t>Technical result</w:t>
             </w:r>
           </w:p>
         </w:tc>
@@ -560,7 +369,7 @@
           </w:tcPr>
           <w:p>
             <w:r>
-              <w:t>2026-03-20</w:t>
+              <w:t>Crawler and paper acquisition</w:t>
             </w:r>
           </w:p>
         </w:tc>
@@ -570,7 +379,7 @@
           </w:tcPr>
           <w:p>
             <w:r>
-              <w:t>Cumulative and field-aware soft feedback learning</w:t>
+              <w:t>Multi-source search, multi-stage filtering, EN/TR workflows, DergiPark support, PDF validation</w:t>
             </w:r>
           </w:p>
         </w:tc>
@@ -580,7 +389,7 @@
           </w:tcPr>
           <w:p>
             <w:r>
-              <w:t>Terms learned from labels started feeding back into crawler scoring</w:t>
+              <w:t>Papers entering the system became more selective and more meaningful</w:t>
             </w:r>
           </w:p>
         </w:tc>
@@ -592,7 +401,7 @@
           </w:tcPr>
           <w:p>
             <w:r>
-              <w:t>2026-03-21</w:t>
+              <w:t>Backend and data model</w:t>
             </w:r>
           </w:p>
         </w:tc>
@@ -602,7 +411,7 @@
           </w:tcPr>
           <w:p>
             <w:r>
-              <w:t>Split English and Turkish workflows</w:t>
+              <w:t>Shared database schema, search-evidence records, annotation tables, RLS policies</w:t>
             </w:r>
           </w:p>
         </w:tc>
@@ -612,7 +421,7 @@
           </w:tcPr>
           <w:p>
             <w:r>
-              <w:t>EN/TR sources began to be managed with separate language-specific targets</w:t>
+              <w:t>The UI, crawler, and feedback layer now operate on the same data structure</w:t>
             </w:r>
           </w:p>
         </w:tc>
@@ -624,7 +433,7 @@
           </w:tcPr>
           <w:p>
             <w:r>
-              <w:t>2026-03-22</w:t>
+              <w:t>Annotator and user workflow</w:t>
             </w:r>
           </w:p>
         </w:tc>
@@ -634,7 +443,7 @@
           </w:tcPr>
           <w:p>
             <w:r>
-              <w:t>`Search -&gt; Filter -&gt; Acquisition` refactor and search-evidence tables</w:t>
+              <w:t>PDF viewing, highlight-assisted entry, dynamic food/nutrient form, test mode, global skip</w:t>
             </w:r>
           </w:p>
         </w:tc>
@@ -644,7 +453,7 @@
           </w:tcPr>
           <w:p>
             <w:r>
-              <w:t>Metadata-level filtering and query-evidence storage became possible before PDF download</w:t>
+              <w:t>Expert users can work on real documents faster and with better control</w:t>
             </w:r>
           </w:p>
         </w:tc>
@@ -656,7 +465,7 @@
           </w:tcPr>
           <w:p>
             <w:r>
-              <w:t>2026-03-30</w:t>
+              <w:t>Learning feedback loop</w:t>
             </w:r>
           </w:p>
         </w:tc>
@@ -666,7 +475,7 @@
           </w:tcPr>
           <w:p>
             <w:r>
-              <w:t>Annotator count fix and canonical hit deduplication</w:t>
+              <w:t>Storing user decisions as events and reusing them in later retrieval</w:t>
             </w:r>
           </w:p>
         </w:tc>
@@ -676,103 +485,7 @@
           </w:tcPr>
           <w:p>
             <w:r>
-              <w:t>UI data quality and crawler evidence consistency improved</w:t>
-            </w:r>
-          </w:p>
-        </w:tc>
-      </w:tr>
-      <w:tr>
-        <w:tc>
-          <w:tcPr>
-            <w:tcW w:type="dxa" w:w="3213"/>
-          </w:tcPr>
-          <w:p>
-            <w:r>
-              <w:t>2026-03-30</w:t>
-            </w:r>
-          </w:p>
-        </w:tc>
-        <w:tc>
-          <w:tcPr>
-            <w:tcW w:type="dxa" w:w="3213"/>
-          </w:tcPr>
-          <w:p>
-            <w:r>
-              <w:t>Turkish crawl quotas, metadata-only hit persistence, DergiPark index refresh</w:t>
-            </w:r>
-          </w:p>
-        </w:tc>
-        <w:tc>
-          <w:tcPr>
-            <w:tcW w:type="dxa" w:w="3213"/>
-          </w:tcPr>
-          <w:p>
-            <w:r>
-              <w:t>More controlled and traceable Turkish-literature acquisition was established</w:t>
-            </w:r>
-          </w:p>
-        </w:tc>
-      </w:tr>
-      <w:tr>
-        <w:tc>
-          <w:tcPr>
-            <w:tcW w:type="dxa" w:w="3213"/>
-          </w:tcPr>
-          <w:p>
-            <w:r>
-              <w:t>2026-03-30</w:t>
-            </w:r>
-          </w:p>
-        </w:tc>
-        <w:tc>
-          <w:tcPr>
-            <w:tcW w:type="dxa" w:w="3213"/>
-          </w:tcPr>
-          <w:p>
-            <w:r>
-              <w:t>Query-batch feedback and search-gate batch accounting</w:t>
-            </w:r>
-          </w:p>
-        </w:tc>
-        <w:tc>
-          <w:tcPr>
-            <w:tcW w:type="dxa" w:w="3213"/>
-          </w:tcPr>
-          <w:p>
-            <w:r>
-              <w:t>It became measurable which query batches yield better results</w:t>
-            </w:r>
-          </w:p>
-        </w:tc>
-      </w:tr>
-      <w:tr>
-        <w:tc>
-          <w:tcPr>
-            <w:tcW w:type="dxa" w:w="3213"/>
-          </w:tcPr>
-          <w:p>
-            <w:r>
-              <w:t>2026-03-30</w:t>
-            </w:r>
-          </w:p>
-        </w:tc>
-        <w:tc>
-          <w:tcPr>
-            <w:tcW w:type="dxa" w:w="3213"/>
-          </w:tcPr>
-          <w:p>
-            <w:r>
-              <w:t>Removal of hard-negative veto logic</w:t>
-            </w:r>
-          </w:p>
-        </w:tc>
-        <w:tc>
-          <w:tcPr>
-            <w:tcW w:type="dxa" w:w="3213"/>
-          </w:tcPr>
-          <w:p>
-            <w:r>
-              <w:t>Crawler decisions became more balanced through soft penalties instead of hard vetoes</w:t>
+              <w:t>The system moved toward a real closed loop that learns from user behavior</w:t>
             </w:r>
           </w:p>
         </w:tc>
@@ -1361,143 +1074,79 @@
     </w:p>
     <w:p>
       <w:r>
-        <w:t xml:space="preserve">On the backend side, the team first established a normalized reference-data schema. The </w:t>
+        <w:t>The main backend decision was to organize the system around one shared data model. That model can be understood through four parts: the shared food/nutrient vocabulary, the papers and search evidence entering the system, the expert annotation records, and the event logs that preserve user decisions as feedback.</w:t>
+      </w:r>
+    </w:p>
+    <w:p>
+      <w:r>
+        <w:t>The point of this structure is not only storage. It allows the UI, crawler, and feedback logic to stay connected instead of becoming separate tools. For example, the names used in the user interface and the terms reused by the crawler rely on the same reference vocabulary, while the reason a paper entered the system and the later annotation built on top of it are tied to the same paper record.</w:t>
+      </w:r>
+    </w:p>
+    <w:p>
+      <w:r>
+        <w:t xml:space="preserve">Figure 3 presents a simplified database summary derived from </w:t>
       </w:r>
       <w:r>
         <w:rPr>
           <w:rFonts w:ascii="Courier New" w:hAnsi="Courier New" w:eastAsia="Courier New"/>
         </w:rPr>
-        <w:t>entities</w:t>
+        <w:t>apps/expert-annotator/migration.sql</w:t>
       </w:r>
       <w:r>
-        <w:t xml:space="preserve">, </w:t>
+        <w:t>, which is the code-level source of truth for the active Supabase schema.</w:t>
+      </w:r>
+    </w:p>
+    <w:p>
+      <w:pPr>
+        <w:jc w:val="center"/>
+      </w:pPr>
+      <w:r>
+        <w:drawing>
+          <wp:inline xmlns:a="http://schemas.openxmlformats.org/drawingml/2006/main" xmlns:pic="http://schemas.openxmlformats.org/drawingml/2006/picture">
+            <wp:extent cx="5669280" cy="3342252"/>
+            <wp:docPr id="3" name="Picture 3"/>
+            <wp:cNvGraphicFramePr>
+              <a:graphicFrameLocks noChangeAspect="1"/>
+            </wp:cNvGraphicFramePr>
+            <a:graphic>
+              <a:graphicData uri="http://schemas.openxmlformats.org/drawingml/2006/picture">
+                <pic:pic>
+                  <pic:nvPicPr>
+                    <pic:cNvPr id="0" name="figure_3_database_schema_en.png"/>
+                    <pic:cNvPicPr/>
+                  </pic:nvPicPr>
+                  <pic:blipFill>
+                    <a:blip r:embed="rId11"/>
+                    <a:stretch>
+                      <a:fillRect/>
+                    </a:stretch>
+                  </pic:blipFill>
+                  <pic:spPr>
+                    <a:xfrm>
+                      <a:off x="0" y="0"/>
+                      <a:ext cx="5669280" cy="3342252"/>
+                    </a:xfrm>
+                    <a:prstGeom prst="rect"/>
+                  </pic:spPr>
+                </pic:pic>
+              </a:graphicData>
+            </a:graphic>
+          </wp:inline>
+        </w:drawing>
+      </w:r>
+    </w:p>
+    <w:p>
+      <w:r>
+        <w:t xml:space="preserve">Figure 3. Simplified view of the main database structure used in the midterm system, grouped into four responsibilities so the project is easier to understand. The summary is derived from the current </w:t>
       </w:r>
       <w:r>
         <w:rPr>
           <w:rFonts w:ascii="Courier New" w:hAnsi="Courier New" w:eastAsia="Courier New"/>
         </w:rPr>
-        <w:t>entity_aliases</w:t>
+        <w:t>migration.sql</w:t>
       </w:r>
       <w:r>
-        <w:t xml:space="preserve">, </w:t>
-      </w:r>
-      <w:r>
-        <w:rPr>
-          <w:rFonts w:ascii="Courier New" w:hAnsi="Courier New" w:eastAsia="Courier New"/>
-        </w:rPr>
-        <w:t>master_nutrients</w:t>
-      </w:r>
-      <w:r>
-        <w:t xml:space="preserve">, </w:t>
-      </w:r>
-      <w:r>
-        <w:rPr>
-          <w:rFonts w:ascii="Courier New" w:hAnsi="Courier New" w:eastAsia="Courier New"/>
-        </w:rPr>
-        <w:t>sources</w:t>
-      </w:r>
-      <w:r>
-        <w:t xml:space="preserve">, and </w:t>
-      </w:r>
-      <w:r>
-        <w:rPr>
-          <w:rFonts w:ascii="Courier New" w:hAnsi="Courier New" w:eastAsia="Courier New"/>
-        </w:rPr>
-        <w:t>claims</w:t>
-      </w:r>
-      <w:r>
-        <w:t xml:space="preserve"> tables represent the food and nutrient vocabulary. This layer is intentionally separated from user annotations, which allows both the frontend autocomplete components and crawler term-generation logic to reuse the same controlled vocabulary.</w:t>
-      </w:r>
-    </w:p>
-    <w:p>
-      <w:r>
-        <w:t xml:space="preserve">On top of that, a second relational layer was built for annotation. The </w:t>
-      </w:r>
-      <w:r>
-        <w:rPr>
-          <w:rFonts w:ascii="Courier New" w:hAnsi="Courier New" w:eastAsia="Courier New"/>
-        </w:rPr>
-        <w:t>papers</w:t>
-      </w:r>
-      <w:r>
-        <w:t xml:space="preserve"> table stores the imported paper records, </w:t>
-      </w:r>
-      <w:r>
-        <w:rPr>
-          <w:rFonts w:ascii="Courier New" w:hAnsi="Courier New" w:eastAsia="Courier New"/>
-        </w:rPr>
-        <w:t>annotations</w:t>
-      </w:r>
-      <w:r>
-        <w:t xml:space="preserve"> stores per-user paper state, and </w:t>
-      </w:r>
-      <w:r>
-        <w:rPr>
-          <w:rFonts w:ascii="Courier New" w:hAnsi="Courier New" w:eastAsia="Courier New"/>
-        </w:rPr>
-        <w:t>food_items</w:t>
-      </w:r>
-      <w:r>
-        <w:t xml:space="preserve"> plus </w:t>
-      </w:r>
-      <w:r>
-        <w:rPr>
-          <w:rFonts w:ascii="Courier New" w:hAnsi="Courier New" w:eastAsia="Courier New"/>
-        </w:rPr>
-        <w:t>annotation_nutrient_values</w:t>
-      </w:r>
-      <w:r>
-        <w:t xml:space="preserve"> store flexible food/nutrient entries. A dynamic row-based structure was preferred over a rigid nutrient panel. As a result, one paper may contain only proximate composition while another may include vitamins or minerals without the model becoming artificially restrictive.</w:t>
-      </w:r>
-    </w:p>
-    <w:p>
-      <w:r>
-        <w:t xml:space="preserve">During the midterm period the backend was expanded in two important ways. First, </w:t>
-      </w:r>
-      <w:r>
-        <w:rPr>
-          <w:rFonts w:ascii="Courier New" w:hAnsi="Courier New" w:eastAsia="Courier New"/>
-        </w:rPr>
-        <w:t>paper_label_events</w:t>
-      </w:r>
-      <w:r>
-        <w:t xml:space="preserve"> and </w:t>
-      </w:r>
-      <w:r>
-        <w:rPr>
-          <w:rFonts w:ascii="Courier New" w:hAnsi="Courier New" w:eastAsia="Courier New"/>
-        </w:rPr>
-        <w:t>paper_global_labels</w:t>
-      </w:r>
-      <w:r>
-        <w:t xml:space="preserve"> were added so user actions could be stored as learning-oriented event data. Second, </w:t>
-      </w:r>
-      <w:r>
-        <w:rPr>
-          <w:rFonts w:ascii="Courier New" w:hAnsi="Courier New" w:eastAsia="Courier New"/>
-        </w:rPr>
-        <w:t>paper_search_hits</w:t>
-      </w:r>
-      <w:r>
-        <w:t xml:space="preserve">, </w:t>
-      </w:r>
-      <w:r>
-        <w:rPr>
-          <w:rFonts w:ascii="Courier New" w:hAnsi="Courier New" w:eastAsia="Courier New"/>
-        </w:rPr>
-        <w:t>paper_search_batches</w:t>
-      </w:r>
-      <w:r>
-        <w:t xml:space="preserve">, and </w:t>
-      </w:r>
-      <w:r>
-        <w:rPr>
-          <w:rFonts w:ascii="Courier New" w:hAnsi="Courier New" w:eastAsia="Courier New"/>
-        </w:rPr>
-        <w:t>paper_search_batch_hits</w:t>
-      </w:r>
-      <w:r>
-        <w:t xml:space="preserve"> were added so the crawler stores not only accepted papers but also the search evidence that led to them. This makes it possible to answer questions such as "which query combinations worked better?" directly from the database.</w:t>
+        <w:t xml:space="preserve"> schema definition.</w:t>
       </w:r>
     </w:p>
     <w:p>
@@ -1515,76 +1164,17 @@
     </w:p>
     <w:p>
       <w:r>
-        <w:t xml:space="preserve">The center of the annotator interface is </w:t>
-      </w:r>
-      <w:r>
-        <w:rPr>
-          <w:rFonts w:ascii="Courier New" w:hAnsi="Courier New" w:eastAsia="Courier New"/>
-        </w:rPr>
-        <w:t>Annotate.jsx</w:t>
-      </w:r>
-      <w:r>
-        <w:t>. When the application loads, this component fetches papers, the current user’s saved annotation states, the nutrient reference list, and the food catalog. When the selected paper changes, any previous annotation for that paper is restored so the user can continue from the last saved point.</w:t>
+        <w:t>The annotator interface is designed as a working screen where the expert can read a paper and enter structured data at the same time. The user opens a paper from the system queue, sees any previously saved work, and continues from the last meaningful state.</w:t>
       </w:r>
     </w:p>
     <w:p>
       <w:r>
-        <w:t xml:space="preserve">The UI uses a dynamic form model for food and nutrient entry. Each food item can contain an arbitrary number of nutrient rows. </w:t>
-      </w:r>
-      <w:r>
-        <w:rPr>
-          <w:rFonts w:ascii="Courier New" w:hAnsi="Courier New" w:eastAsia="Courier New"/>
-        </w:rPr>
-        <w:t>FoodAutocomplete.jsx</w:t>
-      </w:r>
-      <w:r>
-        <w:t xml:space="preserve"> and </w:t>
-      </w:r>
-      <w:r>
-        <w:rPr>
-          <w:rFonts w:ascii="Courier New" w:hAnsi="Courier New" w:eastAsia="Courier New"/>
-        </w:rPr>
-        <w:t>NutrientAutocomplete.jsx</w:t>
-      </w:r>
-      <w:r>
-        <w:t xml:space="preserve"> rank candidates using exact matches, prefix matches, token normalization, and alias handling. This means the user does not need to type the exact canonical database name every time.</w:t>
+        <w:t>Two ideas define the interface. First, data entry is not restricted to fixed columns; the user can add as many food items and nutrient values as the paper requires. Second, the PDF and the form are not disconnected; the user can read the document and move more quickly into structured entry when relevant nutrient content is detected.</w:t>
       </w:r>
     </w:p>
     <w:p>
       <w:r>
-        <w:t xml:space="preserve">For PDF interaction, </w:t>
-      </w:r>
-      <w:r>
-        <w:rPr>
-          <w:rFonts w:ascii="Courier New" w:hAnsi="Courier New" w:eastAsia="Courier New"/>
-        </w:rPr>
-        <w:t>PdfViewer.jsx</w:t>
-      </w:r>
-      <w:r>
-        <w:t xml:space="preserve"> and </w:t>
-      </w:r>
-      <w:r>
-        <w:rPr>
-          <w:rFonts w:ascii="Courier New" w:hAnsi="Courier New" w:eastAsia="Courier New"/>
-        </w:rPr>
-        <w:t>PdfTextScanner.js</w:t>
-      </w:r>
-      <w:r>
-        <w:t xml:space="preserve"> work together. The text-layer spans produced by PDF.js are scanned, nutrient terms are wrapped with </w:t>
-      </w:r>
-      <w:r>
-        <w:rPr>
-          <w:rFonts w:ascii="Courier New" w:hAnsi="Courier New" w:eastAsia="Courier New"/>
-        </w:rPr>
-        <w:t>&lt;mark&gt;</w:t>
-      </w:r>
-      <w:r>
-        <w:t xml:space="preserve"> where appropriate, and the user can click those highlights to open a quick nutrient-entry popover. This turns the interface from a plain data-entry form into a document-aware annotation tool.</w:t>
-      </w:r>
-    </w:p>
-    <w:p>
-      <w:r>
-        <w:t>Three interface behaviors were particularly added or improved during the midterm period:</w:t>
+        <w:t>Three interface behaviors are especially important:</w:t>
       </w:r>
     </w:p>
     <w:p>
@@ -1622,7 +1212,7 @@
     </w:p>
     <w:p>
       <w:r>
-        <w:t>Figure 3 was generated to show that the crawler now produces staged and measurable funnel outputs.</w:t>
+        <w:t>Figure 4 was added to show that the crawler now produces a measurable staged flow.</w:t>
       </w:r>
     </w:p>
     <w:p>
@@ -1633,7 +1223,7 @@
         <w:drawing>
           <wp:inline xmlns:a="http://schemas.openxmlformats.org/drawingml/2006/main" xmlns:pic="http://schemas.openxmlformats.org/drawingml/2006/picture">
             <wp:extent cx="5669280" cy="3099168"/>
-            <wp:docPr id="3" name="Picture 3"/>
+            <wp:docPr id="4" name="Picture 4"/>
             <wp:cNvGraphicFramePr>
               <a:graphicFrameLocks noChangeAspect="1"/>
             </wp:cNvGraphicFramePr>
@@ -1641,11 +1231,11 @@
               <a:graphicData uri="http://schemas.openxmlformats.org/drawingml/2006/picture">
                 <pic:pic>
                   <pic:nvPicPr>
-                    <pic:cNvPr id="0" name="figure_3_crawler_funnel_example_en.png"/>
+                    <pic:cNvPr id="0" name="figure_4_crawler_funnel_example_en.png"/>
                     <pic:cNvPicPr/>
                   </pic:nvPicPr>
                   <pic:blipFill>
-                    <a:blip r:embed="rId11"/>
+                    <a:blip r:embed="rId12"/>
                     <a:stretch>
                       <a:fillRect/>
                     </a:stretch>
@@ -1666,21 +1256,12 @@
     </w:p>
     <w:p>
       <w:r>
-        <w:t xml:space="preserve">Figure 3. Stage counts derived from the manifest summary of the example Turkish live run dated </w:t>
-      </w:r>
-      <w:r>
-        <w:rPr>
-          <w:rFonts w:ascii="Courier New" w:hAnsi="Courier New" w:eastAsia="Courier New"/>
-        </w:rPr>
-        <w:t>2026-03-30</w:t>
-      </w:r>
-      <w:r>
-        <w:t>. This figure is not presented as a full benchmark; it is included to show that the pipeline already produces measurable staged behavior.</w:t>
+        <w:t>Figure 4. Stage counts derived from the manifest summary of a representative Turkish live run. This figure is not presented as a benchmark; it is included to show that the pipeline already produces measurable staged behavior.</w:t>
       </w:r>
     </w:p>
     <w:p>
       <w:r>
-        <w:t>For the real annotator UI screenshot, Figure 4 is intentionally left as a placeholder.</w:t>
+        <w:t>For the real annotator UI screenshot, Figure 5 is intentionally left as a placeholder.</w:t>
       </w:r>
     </w:p>
     <w:p>
@@ -1691,7 +1272,7 @@
         <w:drawing>
           <wp:inline xmlns:a="http://schemas.openxmlformats.org/drawingml/2006/main" xmlns:pic="http://schemas.openxmlformats.org/drawingml/2006/picture">
             <wp:extent cx="5669280" cy="3130743"/>
-            <wp:docPr id="4" name="Picture 4"/>
+            <wp:docPr id="5" name="Picture 5"/>
             <wp:cNvGraphicFramePr>
               <a:graphicFrameLocks noChangeAspect="1"/>
             </wp:cNvGraphicFramePr>
@@ -1699,11 +1280,11 @@
               <a:graphicData uri="http://schemas.openxmlformats.org/drawingml/2006/picture">
                 <pic:pic>
                   <pic:nvPicPr>
-                    <pic:cNvPr id="0" name="figure_4_annotator_placeholder_en.png"/>
+                    <pic:cNvPr id="0" name="figure_5_annotator_placeholder_en.png"/>
                     <pic:cNvPicPr/>
                   </pic:nvPicPr>
                   <pic:blipFill>
-                    <a:blip r:embed="rId12"/>
+                    <a:blip r:embed="rId13"/>
                     <a:stretch>
                       <a:fillRect/>
                     </a:stretch>
@@ -1724,13 +1305,13 @@
     </w:p>
     <w:p>
       <w:r>
-        <w:t xml:space="preserve">Figure 4. Before final submission, this visual should be replaced with a real screenshot of the current annotator interface. The simplest approach is to replace </w:t>
+        <w:t xml:space="preserve">Figure 5. Before final submission, this visual should be replaced with a real screenshot of the current annotator interface. The simplest approach is to replace </w:t>
       </w:r>
       <w:r>
         <w:rPr>
           <w:rFonts w:ascii="Courier New" w:hAnsi="Courier New" w:eastAsia="Courier New"/>
         </w:rPr>
-        <w:t>docs/defense/assets/figure_4_annotator_placeholder_en.png</w:t>
+        <w:t>docs/defense/assets/figure_5_annotator_placeholder_en.png</w:t>
       </w:r>
       <w:r>
         <w:t xml:space="preserve"> with the screenshot under the same filename and rerun the export script. The image should include the PDF viewer, an example highlighted nutrient, the food-item form, and the progress/status area in the same frame.</w:t>
@@ -1746,7 +1327,7 @@
     </w:p>
     <w:p>
       <w:r>
-        <w:t>The crawler was not designed as a one-step search script. By the midterm stage, the implemented approach has three stages:</w:t>
+        <w:t>The crawler was not designed as a one-step search script. Instead, it was built as a staged selection pipeline. The basic approach has three steps:</w:t>
       </w:r>
     </w:p>
     <w:p>
@@ -1793,100 +1374,17 @@
     </w:p>
     <w:p>
       <w:r>
-        <w:t>This separation is an important engineering decision. Downloading every candidate PDF would be both expensive and unnecessary. The pre-filtering step allows fewer but stronger candidates to move to full-text acquisition.</w:t>
+        <w:t>This separation is an important engineering decision. Downloading every candidate PDF would be both expensive and unnecessary. The pre-filtering step allows fewer but stronger candidates to move into full-text acquisition.</w:t>
       </w:r>
     </w:p>
     <w:p>
       <w:r>
-        <w:t>The filtering logic combines several signals:</w:t>
-      </w:r>
-    </w:p>
-    <w:p>
-      <w:pPr>
-        <w:pStyle w:val="ListBullet"/>
-      </w:pPr>
-      <w:r>
-        <w:t>composition- and nutrient-content-oriented lexical patterns,</w:t>
-      </w:r>
-    </w:p>
-    <w:p>
-      <w:pPr>
-        <w:pStyle w:val="ListBullet"/>
-      </w:pPr>
-      <w:r>
-        <w:t xml:space="preserve">unit signals such as </w:t>
-      </w:r>
-      <w:r>
-        <w:rPr>
-          <w:rFonts w:ascii="Courier New" w:hAnsi="Courier New" w:eastAsia="Courier New"/>
-        </w:rPr>
-        <w:t>mg/100g</w:t>
-      </w:r>
-      <w:r>
-        <w:t xml:space="preserve"> and </w:t>
-      </w:r>
-      <w:r>
-        <w:rPr>
-          <w:rFonts w:ascii="Courier New" w:hAnsi="Courier New" w:eastAsia="Courier New"/>
-        </w:rPr>
-        <w:t>g/100g</w:t>
-      </w:r>
-      <w:r>
-        <w:t>,</w:t>
-      </w:r>
-    </w:p>
-    <w:p>
-      <w:pPr>
-        <w:pStyle w:val="ListBullet"/>
-      </w:pPr>
-      <w:r>
-        <w:t>food-term and nutrient-term hits,</w:t>
-      </w:r>
-    </w:p>
-    <w:p>
-      <w:pPr>
-        <w:pStyle w:val="ListBullet"/>
-      </w:pPr>
-      <w:r>
-        <w:t>negative signals related to health outcomes and clinical contexts,</w:t>
-      </w:r>
-    </w:p>
-    <w:p>
-      <w:pPr>
-        <w:pStyle w:val="ListBullet"/>
-      </w:pPr>
-      <w:r>
-        <w:t>English and multilingual embedding similarity,</w:t>
-      </w:r>
-    </w:p>
-    <w:p>
-      <w:pPr>
-        <w:pStyle w:val="ListBullet"/>
-      </w:pPr>
-      <w:r>
-        <w:t>feedback terms derived from user labels,</w:t>
-      </w:r>
-    </w:p>
-    <w:p>
-      <w:pPr>
-        <w:pStyle w:val="ListBullet"/>
-      </w:pPr>
-      <w:r>
-        <w:t>source-level priors and query-batch yield information.</w:t>
+        <w:t>The filtering stage does not rely on a single rule. Instead, it combines three broader signal groups: domain-specific keyword and unit clues, semantic suitability based on embeddings, and feedback signals learned from previous user behavior. This makes the system more robust than a simple keyword matcher.</w:t>
       </w:r>
     </w:p>
     <w:p>
       <w:r>
-        <w:t xml:space="preserve">Near the end of the midterm period, the crawler was expanded in two major directions. First, English and Turkish workflows were split so that acceptance targets are managed per language. Second, a </w:t>
-      </w:r>
-      <w:r>
-        <w:rPr>
-          <w:rFonts w:ascii="Courier New" w:hAnsi="Courier New" w:eastAsia="Courier New"/>
-        </w:rPr>
-        <w:t>query-batch feedback</w:t>
-      </w:r>
-      <w:r>
-        <w:t xml:space="preserve"> mechanism was added, allowing the system to score not only which terms are useful but also which query batches tend to lead to better labeled outcomes.</w:t>
+        <w:t>Two crawler capabilities are especially important at this stage. First, English and Turkish literature are handled as separate target pools. Second, user feedback is reused not only at the term level but also at the query-batch level.</w:t>
       </w:r>
     </w:p>
     <w:p>
@@ -1913,105 +1411,12 @@
         <w:t>feedback/update_terms.py</w:t>
       </w:r>
       <w:r>
-        <w:t xml:space="preserve"> script reads the </w:t>
-      </w:r>
-      <w:r>
-        <w:rPr>
-          <w:rFonts w:ascii="Courier New" w:hAnsi="Courier New" w:eastAsia="Courier New"/>
-        </w:rPr>
-        <w:t>paper_label_events</w:t>
-      </w:r>
-      <w:r>
-        <w:t xml:space="preserve"> and </w:t>
-      </w:r>
-      <w:r>
-        <w:rPr>
-          <w:rFonts w:ascii="Courier New" w:hAnsi="Courier New" w:eastAsia="Courier New"/>
-        </w:rPr>
-        <w:t>paper_global_labels</w:t>
-      </w:r>
-      <w:r>
-        <w:t xml:space="preserve"> records created by users and derives training labels. The current logic is:</w:t>
-      </w:r>
-    </w:p>
-    <w:p>
-      <w:pPr>
-        <w:pStyle w:val="ListBullet"/>
-      </w:pPr>
-      <w:r>
-        <w:rPr>
-          <w:rFonts w:ascii="Courier New" w:hAnsi="Courier New" w:eastAsia="Courier New"/>
-        </w:rPr>
-        <w:t>draft</w:t>
-      </w:r>
-      <w:r>
-        <w:t xml:space="preserve"> or </w:t>
-      </w:r>
-      <w:r>
-        <w:rPr>
-          <w:rFonts w:ascii="Courier New" w:hAnsi="Courier New" w:eastAsia="Courier New"/>
-        </w:rPr>
-        <w:t>done</w:t>
-      </w:r>
-      <w:r>
-        <w:t xml:space="preserve"> counts as positive only when </w:t>
-      </w:r>
-      <w:r>
-        <w:rPr>
-          <w:rFonts w:ascii="Courier New" w:hAnsi="Courier New" w:eastAsia="Courier New"/>
-        </w:rPr>
-        <w:t>has_data=true</w:t>
-      </w:r>
-      <w:r>
-        <w:t xml:space="preserve">, </w:t>
-      </w:r>
-      <w:r>
-        <w:rPr>
-          <w:rFonts w:ascii="Courier New" w:hAnsi="Courier New" w:eastAsia="Courier New"/>
-        </w:rPr>
-        <w:t>food_item_count&gt;0</w:t>
-      </w:r>
-      <w:r>
-        <w:t xml:space="preserve">, and </w:t>
-      </w:r>
-      <w:r>
-        <w:rPr>
-          <w:rFonts w:ascii="Courier New" w:hAnsi="Courier New" w:eastAsia="Courier New"/>
-        </w:rPr>
-        <w:t>nutrient_value_count&gt;0</w:t>
-      </w:r>
-      <w:r>
-        <w:t>,</w:t>
-      </w:r>
-    </w:p>
-    <w:p>
-      <w:pPr>
-        <w:pStyle w:val="ListBullet"/>
-      </w:pPr>
-      <w:r>
-        <w:t xml:space="preserve">a global </w:t>
-      </w:r>
-      <w:r>
-        <w:rPr>
-          <w:rFonts w:ascii="Courier New" w:hAnsi="Courier New" w:eastAsia="Courier New"/>
-        </w:rPr>
-        <w:t>definitely_no_data</w:t>
-      </w:r>
-      <w:r>
-        <w:t xml:space="preserve"> label or skip signals from at least two different users count as negative,</w:t>
-      </w:r>
-    </w:p>
-    <w:p>
-      <w:pPr>
-        <w:pStyle w:val="ListBullet"/>
-      </w:pPr>
-      <w:r>
-        <w:t>conflicting cases are excluded from training.</w:t>
+        <w:t xml:space="preserve"> script reads the user-created event records and turns them into learning signals. The idea is straightforward: if the user found and saved meaningful data, that case is treated as positive; if the paper clearly contains no relevant data or is repeatedly skipped, it is treated as negative; and if the evidence is mixed, it is kept out of training.</w:t>
       </w:r>
     </w:p>
     <w:p>
       <w:r>
-        <w:t>From these examples, the system extracts n-gram terms at both title-only and title+abstract levels, compares positive and negative distributions, and produces query phrases, anchor phrases, weighted terms, source priors, and batch scores. The crawler then consumes those outputs as soft scores rather than hard veto rules. In other words, feedback is treated as a balanced scoring signal instead of an irreversible rejection.</w:t>
+        <w:t>The resulting feedback is then consumed by the crawler as a soft scoring signal. In other words, the system does not treat feedback as a rigid veto. It converts user experience into a more balanced ranking signal for later retrieval.</w:t>
       </w:r>
     </w:p>
     <w:p>

</xml_diff>

<commit_message>
Tighten midterm report wording
</commit_message>
<xml_diff>
--- a/docs/defense/docx/3_Sinif_Proje_Raporu_YAZILIM_KTUN_EN.docx
+++ b/docs/defense/docx/3_Sinif_Proje_Raporu_YAZILIM_KTUN_EN.docx
@@ -124,12 +124,12 @@
     </w:p>
     <w:p>
       <w:r>
-        <w:t>By the midterm stage, the team has moved beyond a purely conceptual design and delivered a working system core. At this point OpenNutri already has an infrastructure that can discover candidate papers from scientific sources, filter them through multiple stages, transfer suitable PDF files into the system, let an expert user create structured annotations on those papers, and feed those annotation outcomes back into later crawling decisions.</w:t>
+        <w:t>By the midterm stage, OpenNutri has a working core system. It discovers candidate papers from scientific sources, filters them through multiple stages, imports suitable PDFs, provides a structured annotation interface to the expert user, and feeds user decisions back into later crawling decisions.</w:t>
       </w:r>
     </w:p>
     <w:p>
       <w:r>
-        <w:t>These outputs do not exist as disconnected modules. The core project idea is simple: the system first finds promising papers, the expert user reviews them and enters structured data, and those user decisions then improve the next search cycle. By the midterm stage, the core pieces of that loop are already working together.</w:t>
+        <w:t>The project flow is straightforward: the system finds papers, the expert user enters structured data on top of the document, and those labels improve later search and ranking. The main parts of that loop are already working together.</w:t>
       </w:r>
     </w:p>
     <w:p>
@@ -293,7 +293,7 @@
           </w:tcPr>
           <w:p>
             <w:r>
-              <w:t>Outside the scope of this report</w:t>
+              <w:t>Next phase</w:t>
             </w:r>
           </w:p>
         </w:tc>
@@ -303,7 +303,7 @@
           </w:tcPr>
           <w:p>
             <w:r>
-              <w:t>A production-ready extraction pipeline is not claimed as completed yet</w:t>
+              <w:t>This report focuses on the first three working items</w:t>
             </w:r>
           </w:p>
         </w:tc>
@@ -311,12 +311,12 @@
     </w:tbl>
     <w:p>
       <w:r>
-        <w:t>The system can be explained through four main ideas. First, the crawler should not send random papers into the system; it should choose stronger candidates first. Second, both the UI and the crawler should work on the same backend and data model. Third, the expert user needs an annotation screen that supports real work on top of the PDF itself. Fourth, user decisions should not remain a passive record; they should become feedback for later search and ranking.</w:t>
+        <w:t>The system is organized around four ideas: a crawler that selects stronger candidates, a shared backend and data model, an annotation screen designed for work on top of the PDF, and a closed loop that turns user decisions into feedback.</w:t>
       </w:r>
     </w:p>
     <w:p>
       <w:r>
-        <w:t>For that reason, the report focuses on the working system idea rather than the commit-by-commit sequence. Table 2 is therefore organized around the main system parts instead of dates.</w:t>
+        <w:t>Table 2 summarizes that structure through the main system parts.</w:t>
       </w:r>
     </w:p>
     <w:tbl>
@@ -542,7 +542,7 @@
     </w:p>
     <w:p>
       <w:r>
-        <w:t>The key point to emphasize here is that the project has not yet completed every item in the proposal, but the first three goals are no longer only planned. They already exist as working system components. For that reason, the current stage should be evaluated not as a vague middle ground between "design document" and "finished product," but as an early production-stage system whose core infrastructure is already operating in practice.</w:t>
+        <w:t>At the midterm stage, the first three goals already exist as working system components. The current state is an early production-stage system with an operating core infrastructure.</w:t>
       </w:r>
     </w:p>
     <w:p>
@@ -568,7 +568,7 @@
     </w:p>
     <w:p>
       <w:r>
-        <w:t>The objective of OpenNutri is to develop a platform that digitizes food-composition data scattered across scientific literature without removing human expertise from the loop; instead, expert feedback is treated as a central component of the system. To achieve that goal, the project aims to establish three capabilities at the same time:</w:t>
+        <w:t>The objective of OpenNutri is to digitize food-composition data scattered across scientific literature through a platform centered on expert feedback. To achieve that goal, the project establishes three capabilities:</w:t>
       </w:r>
     </w:p>
     <w:p>
@@ -597,7 +597,7 @@
     </w:p>
     <w:p>
       <w:r>
-        <w:t>At the midterm stage, the focus is to build the core version of these three capabilities in line with the first-semester goals. Accordingly, the current work does not claim that a full LLM-based extraction system has already been completed. Instead, it focuses on building the data and user infrastructure that such a system could later rely on for training and validation.</w:t>
+        <w:t>At the midterm stage, the focus is to build the core version of these three capabilities. The current work establishes the data infrastructure, user workflow, and feedback loop.</w:t>
       </w:r>
     </w:p>
     <w:p>
@@ -615,22 +615,22 @@
     </w:p>
     <w:p>
       <w:r>
-        <w:t>The first level is the data-access problem. Food-composition studies are usually published as PDF documents, distributed across different journal infrastructures, and often lack any standard machine-readable output format. In other words, the information exists, but it cannot be used directly as queryable structured data. OpenNutri targets this gap.</w:t>
+        <w:t>The first level is the data-access problem. Food-composition studies are usually published as PDF documents across different journal infrastructures and rarely provide a standard machine-readable output. OpenNutri targets that gap.</w:t>
       </w:r>
     </w:p>
     <w:p>
       <w:r>
-        <w:t>The second level is efficient use of expert time. Expert annotation is expensive and limited. If irrelevant papers reach the annotator queue, expert effort is wasted. For this reason, the project is not only about building a UI; it also tries to improve what reaches the expert by combining the crawler and feedback layers. At the midterm stage, the implemented search gate, metadata filter, PDF validation, and global skip logic directly support this goal.</w:t>
+        <w:t>The second level is efficient use of expert time. Expert annotation is expensive and limited. The crawler, filtering, and feedback layers are therefore designed to deliver more meaningful candidates to the annotator. At the midterm stage, search gate, metadata filter, PDF validation, and global skip logic already support this goal.</w:t>
       </w:r>
     </w:p>
     <w:p>
       <w:r>
-        <w:t>The third level is the visibility of Turkish literature. The proposal explicitly targets PubMed and DergiPark. This choice is deliberate. PubMed Central provides access to international open-access literature, while DergiPark gives access to many studies published in Turkey. The shift toward language-scoped EN/TR workflows is therefore important because Turkish studies are no longer treated as a side effect; they are treated as a distinct target pool.</w:t>
+        <w:t>The third level is the visibility of Turkish literature. PubMed Central brings international open-access literature into the system, while DergiPark provides access to studies published in Turkey. The EN/TR workflow split establishes Turkish literature as a separate target pool.</w:t>
       </w:r>
     </w:p>
     <w:p>
       <w:r>
-        <w:t>From a technical point of view, the project is important not because it uses a single advanced algorithm, but because it combines a normalized data model, multi-source search, layered filtering, PDF validation, user-event logging, and soft feedback learning in one system. This integrated approach goes beyond a conventional CRUD application and creates a strong base for later document segmentation and LLM-based extraction work.</w:t>
+        <w:t>From a technical point of view, the project combines a normalized data model, multi-source search, layered filtering, PDF validation, user-event logging, and soft feedback learning in one system. This structure creates a strong base for later document segmentation and extraction work.</w:t>
       </w:r>
     </w:p>
     <w:p>
@@ -648,7 +648,7 @@
     </w:p>
     <w:p>
       <w:r>
-        <w:t>The project was designed by examining both food-data standards and scientific-document processing tools together. The literature review therefore did not rely only on academic papers; it also considered databases, open-access archives, ontologies, and the software ecosystems used in the implementation.</w:t>
+        <w:t>The literature review examined both food-data standards and scientific-document processing tools. It covered academic papers, databases, open-access archives, ontologies, and the software ecosystems used in the implementation.</w:t>
       </w:r>
     </w:p>
     <w:p>
@@ -661,12 +661,12 @@
     </w:p>
     <w:p>
       <w:r>
-        <w:t>OpenNutri’s data model was not built directly on free-text labels. FoodData Central [1] and the FAO/INFOODS matching approach [2] were reviewed, and the concepts of canonical foods and canonical nutrients were modeled as separate tables. As a result, the food and nutrient choices visible in the UI are tied to a shared vocabulary that can later be reused both for crawler term generation and for validating any future LLM extraction outputs.</w:t>
+        <w:t>OpenNutri’s data model is built around a shared vocabulary. FoodData Central [1] and the FAO/INFOODS matching approach [2] were reviewed, and canonical foods and canonical nutrients were modeled as separate tables. As a result, the food and nutrient choices in the UI and the terms used by the crawler rely on the same vocabulary.</w:t>
       </w:r>
     </w:p>
     <w:p>
       <w:r>
-        <w:t xml:space="preserve">Ontology-centered work such as FoodOn [3] is also relevant, especially for standardizing food names. The current project version does not implement a full ontology integration, but the decision to use </w:t>
+        <w:t xml:space="preserve">Ontology-centered work such as FoodOn [3] is relevant for standardizing food names. The </w:t>
       </w:r>
       <w:r>
         <w:rPr>
@@ -684,7 +684,7 @@
         <w:t>entity_aliases</w:t>
       </w:r>
       <w:r>
-        <w:t xml:space="preserve"> was motivated by the same need for controlled standardization.</w:t>
+        <w:t xml:space="preserve"> structure was chosen for the same standardization need.</w:t>
       </w:r>
     </w:p>
     <w:p>
@@ -710,7 +710,7 @@
     </w:p>
     <w:p>
       <w:r>
-        <w:t xml:space="preserve">The project intentionally avoids fully automating every decision. Human-in-the-loop methodology [7] argues that experts should remain an active part of scientific extraction and verification workflows. In OpenNutri, this idea becomes concrete through the annotator UI and </w:t>
+        <w:t xml:space="preserve">Human-in-the-loop methodology [7] keeps the expert user as an active part of extraction and verification. In OpenNutri, this approach is implemented through the annotator UI and </w:t>
       </w:r>
       <w:r>
         <w:rPr>
@@ -755,7 +755,7 @@
         <w:t>definitely_no_data</w:t>
       </w:r>
       <w:r>
-        <w:t xml:space="preserve"> are not just interface interactions; they also become feedback signals that influence later crawling.</w:t>
+        <w:t xml:space="preserve"> directly become crawler feedback.</w:t>
       </w:r>
     </w:p>
     <w:p>
@@ -768,7 +768,7 @@
     </w:p>
     <w:p>
       <w:r>
-        <w:t>Because article content is usually distributed as PDF, in-browser PDF processing became essential. PDF.js [8] and React [9] were therefore evaluated together. However, the PDF problem is not limited to rendering. Since the PDF text layer is fragmented across spans, the nutrient-highlighting feature required additional scanning, overlap resolution, and click-recovery logic. This highlights an important difference between literature-annotation tools and ordinary web forms.</w:t>
+        <w:t>Because article content is usually distributed as PDF, in-browser PDF processing became essential. PDF.js [8] and React [9] were evaluated together. The nutrient-highlighting feature required extra scanning logic because the PDF text layer is fragmented across spans.</w:t>
       </w:r>
     </w:p>
     <w:p>
@@ -781,7 +781,7 @@
     </w:p>
     <w:p>
       <w:r>
-        <w:t>Supabase [10] was evaluated not merely as a database, but as a single platform layer providing authentication, row-level access control, file storage, and client access. At the midterm stage both the annotator and the data pipeline already share this backend. This choice was meaningful both for data consistency and for fast prototyping.</w:t>
+        <w:t>Supabase [10] was selected because it combines authentication, row-level access control, file storage, and client access in one platform. At the midterm stage, both the annotator and the data pipeline already share this backend.</w:t>
       </w:r>
     </w:p>
     <w:p>
@@ -794,7 +794,7 @@
         <w:pStyle w:val="ListBullet"/>
       </w:pPr>
       <w:r>
-        <w:t>not combining paper discovery and PDF download into a single step,</w:t>
+        <w:t>separating paper discovery, pre-filtering, and PDF acquisition,</w:t>
       </w:r>
     </w:p>
     <w:p>
@@ -802,7 +802,7 @@
         <w:pStyle w:val="ListBullet"/>
       </w:pPr>
       <w:r>
-        <w:t>designing the UI with a dynamic row model instead of fixed nutrient columns,</w:t>
+        <w:t>designing the UI with a dynamic row model,</w:t>
       </w:r>
     </w:p>
     <w:p>
@@ -810,7 +810,7 @@
         <w:pStyle w:val="ListBullet"/>
       </w:pPr>
       <w:r>
-        <w:t>storing labels as event history rather than only a final state,</w:t>
+        <w:t>storing labels as event history,</w:t>
       </w:r>
     </w:p>
     <w:p>
@@ -818,7 +818,7 @@
         <w:pStyle w:val="ListBullet"/>
       </w:pPr>
       <w:r>
-        <w:t>handling Turkish and English sources under the same system but with separate targets,</w:t>
+        <w:t>using separate target pools for Turkish and English sources,</w:t>
       </w:r>
     </w:p>
     <w:p>
@@ -826,12 +826,12 @@
         <w:pStyle w:val="ListBullet"/>
       </w:pPr>
       <w:r>
-        <w:t>using feedback as a soft score instead of a hard rejection rule.</w:t>
+        <w:t>using feedback as a soft scoring signal.</w:t>
       </w:r>
     </w:p>
     <w:p>
       <w:r>
-        <w:t>All of these decisions are already reflected in the current codebase, which means the project has moved from a theoretical design into an implemented system behavior.</w:t>
+        <w:t>All of these decisions are already reflected in the current codebase.</w:t>
       </w:r>
     </w:p>
     <w:p>
@@ -1079,7 +1079,7 @@
     </w:p>
     <w:p>
       <w:r>
-        <w:t>The point of this structure is not only storage. It allows the UI, crawler, and feedback logic to stay connected instead of becoming separate tools. For example, the names used in the user interface and the terms reused by the crawler rely on the same reference vocabulary, while the reason a paper entered the system and the later annotation built on top of it are tied to the same paper record.</w:t>
+        <w:t>This structure keeps the UI, crawler, and feedback logic on the same data model. The names used in the UI and the terms reused by the crawler rely on the same reference vocabulary. The reason a paper entered the system and the later annotation built on top of it are tied to the same paper record.</w:t>
       </w:r>
     </w:p>
     <w:p>
@@ -1169,7 +1169,7 @@
     </w:p>
     <w:p>
       <w:r>
-        <w:t>Two ideas define the interface. First, data entry is not restricted to fixed columns; the user can add as many food items and nutrient values as the paper requires. Second, the PDF and the form are not disconnected; the user can read the document and move more quickly into structured entry when relevant nutrient content is detected.</w:t>
+        <w:t>The interface follows two principles. The user can add as many food items and nutrient values as the paper requires. The PDF and the form are presented in the same working screen so the user can read the document and move quickly into structured entry.</w:t>
       </w:r>
     </w:p>
     <w:p>
@@ -1198,7 +1198,7 @@
         <w:pStyle w:val="ListBullet"/>
       </w:pPr>
       <w:r>
-        <w:t xml:space="preserve">counting only valid food items so that empty placeholder cards do not create incorrect </w:t>
+        <w:t xml:space="preserve">counting valid food items to prevent empty placeholder cards from inflating </w:t>
       </w:r>
       <w:r>
         <w:rPr>
@@ -1207,12 +1207,12 @@
         <w:t>food_item_count</w:t>
       </w:r>
       <w:r>
-        <w:t xml:space="preserve"> values.</w:t>
+        <w:t>.</w:t>
       </w:r>
     </w:p>
     <w:p>
       <w:r>
-        <w:t>Figure 4 was added to show that the crawler now produces a measurable staged flow.</w:t>
+        <w:t>Figure 4 shows the numeric summary produced by the crawler's staged flow.</w:t>
       </w:r>
     </w:p>
     <w:p>
@@ -1256,12 +1256,12 @@
     </w:p>
     <w:p>
       <w:r>
-        <w:t>Figure 4. Stage counts derived from the manifest summary of a representative Turkish live run. This figure is not presented as a benchmark; it is included to show that the pipeline already produces measurable staged behavior.</w:t>
+        <w:t>Figure 4. Stage counts derived from the manifest summary of a representative Turkish live run.</w:t>
       </w:r>
     </w:p>
     <w:p>
       <w:r>
-        <w:t>For the real annotator UI screenshot, Figure 5 is intentionally left as a placeholder.</w:t>
+        <w:t>Figure 5 is the placeholder for the final annotator UI screenshot.</w:t>
       </w:r>
     </w:p>
     <w:p>
@@ -1327,7 +1327,7 @@
     </w:p>
     <w:p>
       <w:r>
-        <w:t>The crawler was not designed as a one-step search script. Instead, it was built as a staged selection pipeline. The basic approach has three steps:</w:t>
+        <w:t>The crawler is built as a staged selection pipeline. The basic approach has three steps:</w:t>
       </w:r>
     </w:p>
     <w:p>
@@ -1374,17 +1374,17 @@
     </w:p>
     <w:p>
       <w:r>
-        <w:t>This separation is an important engineering decision. Downloading every candidate PDF would be both expensive and unnecessary. The pre-filtering step allows fewer but stronger candidates to move into full-text acquisition.</w:t>
+        <w:t>This separation reduces unnecessary PDF downloads and moves fewer, stronger candidates into full-text acquisition.</w:t>
       </w:r>
     </w:p>
     <w:p>
       <w:r>
-        <w:t>The filtering stage does not rely on a single rule. Instead, it combines three broader signal groups: domain-specific keyword and unit clues, semantic suitability based on embeddings, and feedback signals learned from previous user behavior. This makes the system more robust than a simple keyword matcher.</w:t>
+        <w:t>The filtering stage combines three signal groups: domain-specific keyword and unit clues, semantic suitability based on embeddings, and feedback signals learned from previous user behavior.</w:t>
       </w:r>
     </w:p>
     <w:p>
       <w:r>
-        <w:t>Two crawler capabilities are especially important at this stage. First, English and Turkish literature are handled as separate target pools. Second, user feedback is reused not only at the term level but also at the query-batch level.</w:t>
+        <w:t>Two crawler capabilities are especially important at this stage: separate target pools for English and Turkish literature, and feedback reuse at both term and query-batch level.</w:t>
       </w:r>
     </w:p>
     <w:p>
@@ -1411,12 +1411,12 @@
         <w:t>feedback/update_terms.py</w:t>
       </w:r>
       <w:r>
-        <w:t xml:space="preserve"> script reads the user-created event records and turns them into learning signals. The idea is straightforward: if the user found and saved meaningful data, that case is treated as positive; if the paper clearly contains no relevant data or is repeatedly skipped, it is treated as negative; and if the evidence is mixed, it is kept out of training.</w:t>
+        <w:t xml:space="preserve"> script reads user-created event records and turns them into learning signals. Cases with meaningful saved data are treated as positive. Papers that clearly contain no relevant data or are repeatedly skipped are treated as negative. Mixed cases are kept out of training.</w:t>
       </w:r>
     </w:p>
     <w:p>
       <w:r>
-        <w:t>The resulting feedback is then consumed by the crawler as a soft scoring signal. In other words, the system does not treat feedback as a rigid veto. It converts user experience into a more balanced ranking signal for later retrieval.</w:t>
+        <w:t>The resulting feedback is then consumed by the crawler as a soft scoring signal.</w:t>
       </w:r>
     </w:p>
     <w:p>
@@ -1443,12 +1443,12 @@
     </w:p>
     <w:p>
       <w:r>
-        <w:t>At the midterm stage, proposal item four, document segmentation and an LLM-based core extraction process, is not presented as a completed production pipeline. The repository contains exploratory and prototype-level files in that direction, but this report is intentionally limited to the first three working semester goals and the data/feedback infrastructure supporting them.</w:t>
+        <w:t>This report focuses on the first three working semester goals and the data/feedback infrastructure supporting them. Document segmentation and the LLM-based extraction process belong to the next phase.</w:t>
       </w:r>
     </w:p>
     <w:p>
       <w:r>
-        <w:t>Similarly, the real annotator screenshot is still left as a placeholder in this report. The reason is practical: it is better to capture the most up-to-date UI state close to final submission.</w:t>
+        <w:t>The annotator screenshot is still left as a placeholder in this report. It should be replaced with the latest UI state before final submission.</w:t>
       </w:r>
     </w:p>
     <w:p>

</xml_diff>

<commit_message>
Refine defense report emphasis and structure
</commit_message>
<xml_diff>
--- a/docs/defense/docx/3_Sinif_Proje_Raporu_YAZILIM_KTUN_EN.docx
+++ b/docs/defense/docx/3_Sinif_Proje_Raporu_YAZILIM_KTUN_EN.docx
@@ -124,12 +124,30 @@
     </w:p>
     <w:p>
       <w:r>
-        <w:t>By the midterm stage, OpenNutri has a working core system. It discovers candidate papers from scientific sources, filters them through multiple stages, imports suitable PDFs, provides a structured annotation interface to the expert user, and feeds user decisions back into later crawling decisions.</w:t>
+        <w:t xml:space="preserve">By the midterm stage, OpenNutri has a working core system. The crawler collects metadata from Europe PMC, OpenAlex, Semantic Scholar, and DergiPark; applies search gate and metadata filter steps; imports suitable PDFs into the Supabase layer; and hands those papers to the annotator interface. The annotator opens the paper on top of the PDF, stores food and nutrient entries, and turns user decisions into feedback through </w:t>
+      </w:r>
+      <w:r>
+        <w:rPr>
+          <w:rFonts w:ascii="Courier New" w:hAnsi="Courier New" w:eastAsia="Courier New"/>
+        </w:rPr>
+        <w:t>paper_label_events</w:t>
+      </w:r>
+      <w:r>
+        <w:t xml:space="preserve"> and </w:t>
+      </w:r>
+      <w:r>
+        <w:rPr>
+          <w:rFonts w:ascii="Courier New" w:hAnsi="Courier New" w:eastAsia="Courier New"/>
+        </w:rPr>
+        <w:t>paper_global_labels</w:t>
+      </w:r>
+      <w:r>
+        <w:t>.</w:t>
       </w:r>
     </w:p>
     <w:p>
       <w:r>
-        <w:t>The project flow is straightforward: the system finds papers, the expert user enters structured data on top of the document, and those labels improve later search and ranking. The main parts of that loop are already working together.</w:t>
+        <w:t>Three technical decisions define this stage. First, the system performs strong pre-filtering before PDF download, so expert time is spent on stronger candidates. Second, English and Turkish literature are managed as separate target pools, which places Turkish studies inside the direct target scope. Third, expert annotation is part of a closed loop: user decisions become signals that improve later crawler runs.</w:t>
       </w:r>
     </w:p>
     <w:p>
@@ -311,12 +329,7 @@
     </w:tbl>
     <w:p>
       <w:r>
-        <w:t>The system is organized around four ideas: a crawler that selects stronger candidates, a shared backend and data model, an annotation screen designed for work on top of the PDF, and a closed loop that turns user decisions into feedback.</w:t>
-      </w:r>
-    </w:p>
-    <w:p>
-      <w:r>
-        <w:t>Table 2 summarizes that structure through the main system parts.</w:t>
+        <w:t>Table 2 summarizes the main parts of the running system and the role of each part.</w:t>
       </w:r>
     </w:p>
     <w:tbl>
@@ -347,7 +360,7 @@
           </w:tcPr>
           <w:p>
             <w:r>
-              <w:t>Work completed</w:t>
+              <w:t>Capabilities running at this stage</w:t>
             </w:r>
           </w:p>
         </w:tc>
@@ -357,7 +370,7 @@
           </w:tcPr>
           <w:p>
             <w:r>
-              <w:t>Technical result</w:t>
+              <w:t>Role in the project</w:t>
             </w:r>
           </w:p>
         </w:tc>
@@ -389,7 +402,7 @@
           </w:tcPr>
           <w:p>
             <w:r>
-              <w:t>Papers entering the system became more selective and more meaningful</w:t>
+              <w:t>Moves more selective and traceable papers into the annotator queue</w:t>
             </w:r>
           </w:p>
         </w:tc>
@@ -421,7 +434,7 @@
           </w:tcPr>
           <w:p>
             <w:r>
-              <w:t>The UI, crawler, and feedback layer now operate on the same data structure</w:t>
+              <w:t>Keeps the UI, crawler, and feedback layer on the same data contract</w:t>
             </w:r>
           </w:p>
         </w:tc>
@@ -453,7 +466,7 @@
           </w:tcPr>
           <w:p>
             <w:r>
-              <w:t>Expert users can work on real documents faster and with better control</w:t>
+              <w:t>Lets the expert user work directly on the document in a controlled way</w:t>
             </w:r>
           </w:p>
         </w:tc>
@@ -475,7 +488,7 @@
           </w:tcPr>
           <w:p>
             <w:r>
-              <w:t>Storing user decisions as events and reusing them in later retrieval</w:t>
+              <w:t>Event logging, global labels, feedback terms, query-batch signals</w:t>
             </w:r>
           </w:p>
         </w:tc>
@@ -485,7 +498,7 @@
           </w:tcPr>
           <w:p>
             <w:r>
-              <w:t>The system moved toward a real closed loop that learns from user behavior</w:t>
+              <w:t>Converts user decisions into later search and ranking signals</w:t>
             </w:r>
           </w:p>
         </w:tc>
@@ -542,7 +555,7 @@
     </w:p>
     <w:p>
       <w:r>
-        <w:t>At the midterm stage, the first three goals already exist as working system components. The current state is an early production-stage system with an operating core infrastructure.</w:t>
+        <w:t>The midterm output is a working core data flow. Paper acquisition, annotation storage, and the feedback chain already operate on the same infrastructure.</w:t>
       </w:r>
     </w:p>
     <w:p>
@@ -568,7 +581,7 @@
     </w:p>
     <w:p>
       <w:r>
-        <w:t>The objective of OpenNutri is to digitize food-composition data scattered across scientific literature through a platform centered on expert feedback. To achieve that goal, the project establishes three capabilities:</w:t>
+        <w:t>The objective of OpenNutri is to build a platform that turns food-composition data scattered across scientific literature into structured records while preserving the link to the source paper. To achieve that goal, the project establishes three capabilities:</w:t>
       </w:r>
     </w:p>
     <w:p>
@@ -597,7 +610,7 @@
     </w:p>
     <w:p>
       <w:r>
-        <w:t>At the midterm stage, the focus is to build the core version of these three capabilities. The current work establishes the data infrastructure, user workflow, and feedback loop.</w:t>
+        <w:t>At the midterm stage, the focus is to make the core version of this structure run end to end. The current work establishes the data infrastructure, user workflow, and feedback loop in the same system.</w:t>
       </w:r>
     </w:p>
     <w:p>
@@ -610,27 +623,22 @@
     </w:p>
     <w:p>
       <w:r>
-        <w:t>The importance of the project appears at three levels.</w:t>
+        <w:t>The importance of the project starts with the data-access problem. Food-composition knowledge is published in thousands of PDFs, but it rarely exists as structured, queryable, source-linked data. OpenNutri targets that gap directly.</w:t>
       </w:r>
     </w:p>
     <w:p>
       <w:r>
-        <w:t>The first level is the data-access problem. Food-composition studies are usually published as PDF documents across different journal infrastructures and rarely provide a standard machine-readable output. OpenNutri targets that gap.</w:t>
+        <w:t>This need is sharper for Turkish literature. Many studies published in Turkey remain inside DergiPark and similar archives without becoming part of standard international food-data infrastructure. As a result, local foods, local varieties, and Turkish-language studies lose digital visibility. The EN/TR workflow split is therefore a scope decision with direct technical consequences.</w:t>
       </w:r>
     </w:p>
     <w:p>
       <w:r>
-        <w:t>The second level is efficient use of expert time. Expert annotation is expensive and limited. The crawler, filtering, and feedback layers are therefore designed to deliver more meaningful candidates to the annotator. At the midterm stage, search gate, metadata filter, PDF validation, and global skip logic already support this goal.</w:t>
+        <w:t>The second major point is expert efficiency. Expert annotation is expensive and limited. OpenNutri combines retrieval, pre-filtering, PDF validation, and feedback so stronger candidates reach the expert user, and expert decisions improve the next run.</w:t>
       </w:r>
     </w:p>
     <w:p>
       <w:r>
-        <w:t>The third level is the visibility of Turkish literature. PubMed Central brings international open-access literature into the system, while DergiPark provides access to studies published in Turkey. The EN/TR workflow split establishes Turkish literature as a separate target pool.</w:t>
-      </w:r>
-    </w:p>
-    <w:p>
-      <w:r>
-        <w:t>From a technical point of view, the project combines a normalized data model, multi-source search, layered filtering, PDF validation, user-event logging, and soft feedback learning in one system. This structure creates a strong base for later document segmentation and extraction work.</w:t>
+        <w:t>In the longer term, this approach can support researchers, health-tech products, public institutions, and export-oriented producers through a domestic data infrastructure. By the midterm stage, the technical foundation for that goal is already in place.</w:t>
       </w:r>
     </w:p>
     <w:p>
@@ -786,52 +794,7 @@
     </w:p>
     <w:p>
       <w:r>
-        <w:t>The literature review led to several engineering decisions:</w:t>
-      </w:r>
-    </w:p>
-    <w:p>
-      <w:pPr>
-        <w:pStyle w:val="ListBullet"/>
-      </w:pPr>
-      <w:r>
-        <w:t>separating paper discovery, pre-filtering, and PDF acquisition,</w:t>
-      </w:r>
-    </w:p>
-    <w:p>
-      <w:pPr>
-        <w:pStyle w:val="ListBullet"/>
-      </w:pPr>
-      <w:r>
-        <w:t>designing the UI with a dynamic row model,</w:t>
-      </w:r>
-    </w:p>
-    <w:p>
-      <w:pPr>
-        <w:pStyle w:val="ListBullet"/>
-      </w:pPr>
-      <w:r>
-        <w:t>storing labels as event history,</w:t>
-      </w:r>
-    </w:p>
-    <w:p>
-      <w:pPr>
-        <w:pStyle w:val="ListBullet"/>
-      </w:pPr>
-      <w:r>
-        <w:t>using separate target pools for Turkish and English sources,</w:t>
-      </w:r>
-    </w:p>
-    <w:p>
-      <w:pPr>
-        <w:pStyle w:val="ListBullet"/>
-      </w:pPr>
-      <w:r>
-        <w:t>using feedback as a soft scoring signal.</w:t>
-      </w:r>
-    </w:p>
-    <w:p>
-      <w:r>
-        <w:t>All of these decisions are already reflected in the current codebase.</w:t>
+        <w:t>Taken together, this literature and platform review explains why the project uses a shared vocabulary, multi-source access, expert annotation on top of PDFs, and a human-in-the-loop verification model.</w:t>
       </w:r>
     </w:p>
     <w:p>
@@ -882,6 +845,11 @@
       </w:pPr>
       <w:r>
         <w:t>the multi-source crawler and feedback layer.</w:t>
+      </w:r>
+    </w:p>
+    <w:p>
+      <w:r>
+        <w:t>Four engineering choices define the current implementation: separating paper discovery from PDF acquisition, using a shared vocabulary and shared database, building annotation around a dynamic row model, and storing user decisions as event-based feedback. The following subsections describe how those choices are implemented.</w:t>
       </w:r>
     </w:p>
     <w:p>
@@ -1169,7 +1137,7 @@
     </w:p>
     <w:p>
       <w:r>
-        <w:t>The interface follows two principles. The user can add as many food items and nutrient values as the paper requires. The PDF and the form are presented in the same working screen so the user can read the document and move quickly into structured entry.</w:t>
+        <w:t>The interface follows two principles. The user can add as many food items and nutrient values as the paper requires. The PDF and the form are presented in the same working screen so the user can read the document and move quickly into structured entry. In practice, this gives the expert user a document-based verification role.</w:t>
       </w:r>
     </w:p>
     <w:p>
@@ -1374,7 +1342,7 @@
     </w:p>
     <w:p>
       <w:r>
-        <w:t>This separation reduces unnecessary PDF downloads and moves fewer, stronger candidates into full-text acquisition.</w:t>
+        <w:t>This separation is the main efficiency decision on the crawler side. It reduces unnecessary PDF downloads and moves fewer, stronger candidates into full-text acquisition.</w:t>
       </w:r>
     </w:p>
     <w:p>
@@ -1416,7 +1384,7 @@
     </w:p>
     <w:p>
       <w:r>
-        <w:t>The resulting feedback is then consumed by the crawler as a soft scoring signal.</w:t>
+        <w:t>This is the clearest architectural idea in the midterm system. User decisions are reused as soft scoring signals in later crawler runs.</w:t>
       </w:r>
     </w:p>
     <w:p>

</xml_diff>

<commit_message>
Polish defense report citations and wording
</commit_message>
<xml_diff>
--- a/docs/defense/docx/3_Sinif_Proje_Raporu_YAZILIM_KTUN_EN.docx
+++ b/docs/defense/docx/3_Sinif_Proje_Raporu_YAZILIM_KTUN_EN.docx
@@ -1052,16 +1052,7 @@
     </w:p>
     <w:p>
       <w:r>
-        <w:t xml:space="preserve">Figure 3 presents a simplified database summary derived from </w:t>
-      </w:r>
-      <w:r>
-        <w:rPr>
-          <w:rFonts w:ascii="Courier New" w:hAnsi="Courier New" w:eastAsia="Courier New"/>
-        </w:rPr>
-        <w:t>apps/expert-annotator/migration.sql</w:t>
-      </w:r>
-      <w:r>
-        <w:t>, which is the code-level source of truth for the active Supabase schema.</w:t>
+        <w:t>Figure 3 presents a simplified database summary derived from the database migration script that defines the active Supabase schema.</w:t>
       </w:r>
     </w:p>
     <w:p>
@@ -1105,16 +1096,7 @@
     </w:p>
     <w:p>
       <w:r>
-        <w:t xml:space="preserve">Figure 3. Simplified view of the main database structure used in the midterm system, grouped into four responsibilities so the project is easier to understand. The summary is derived from the current </w:t>
-      </w:r>
-      <w:r>
-        <w:rPr>
-          <w:rFonts w:ascii="Courier New" w:hAnsi="Courier New" w:eastAsia="Courier New"/>
-        </w:rPr>
-        <w:t>migration.sql</w:t>
-      </w:r>
-      <w:r>
-        <w:t xml:space="preserve"> schema definition.</w:t>
+        <w:t>Figure 3. Simplified view of the main database structure used in the midterm system, grouped into four responsibilities so the project is easier to understand. The summary is derived from the database migration script.</w:t>
       </w:r>
     </w:p>
     <w:p>
@@ -1384,7 +1366,7 @@
     </w:p>
     <w:p>
       <w:r>
-        <w:t>This is the clearest architectural idea in the midterm system. User decisions are reused as soft scoring signals in later crawler runs.</w:t>
+        <w:t>User decisions are reused as soft scoring signals in later crawler runs.</w:t>
       </w:r>
     </w:p>
     <w:p>
@@ -1437,7 +1419,7 @@
         <w:pStyle w:val="ListNumber"/>
       </w:pPr>
       <w:r>
-        <w:t>U.S. Department of Agriculture. FoodData Central. https://fdc.nal.usda.gov/</w:t>
+        <w:t>U.S. Department of Agriculture. *FoodData Central*. Available at: https://fdc.nal.usda.gov/ (Accessed: April 2, 2026).</w:t>
       </w:r>
     </w:p>
     <w:p>
@@ -1445,7 +1427,7 @@
         <w:pStyle w:val="ListNumber"/>
       </w:pPr>
       <w:r>
-        <w:t>FAO/INFOODS. Guidelines for Food Matching. Rome: Food and Agriculture Organization of the United Nations, 2012.</w:t>
+        <w:t>FAO/INFOODS. *Guidelines for Food Matching*. Rome: Food and Agriculture Organization of the United Nations; 2012.</w:t>
       </w:r>
     </w:p>
     <w:p>
@@ -1461,7 +1443,7 @@
         <w:pStyle w:val="ListNumber"/>
       </w:pPr>
       <w:r>
-        <w:t>National Center for Biotechnology Information. PubMed Central (PMC). https://pmc.ncbi.nlm.nih.gov/</w:t>
+        <w:t>National Center for Biotechnology Information. *PubMed Central (PMC)*. Available at: https://pmc.ncbi.nlm.nih.gov/ (Accessed: April 2, 2026).</w:t>
       </w:r>
     </w:p>
     <w:p>
@@ -1469,7 +1451,7 @@
         <w:pStyle w:val="ListNumber"/>
       </w:pPr>
       <w:r>
-        <w:t>Europe PMC. https://europepmc.org/</w:t>
+        <w:t>Europe PMC. *Europe PMC*. Available at: https://europepmc.org/ (Accessed: April 2, 2026).</w:t>
       </w:r>
     </w:p>
     <w:p>
@@ -1477,7 +1459,7 @@
         <w:pStyle w:val="ListNumber"/>
       </w:pPr>
       <w:r>
-        <w:t>DergiPark Akademik. https://dergipark.org.tr/</w:t>
+        <w:t>DergiPark Akademik. *DergiPark Akademik*. Available at: https://dergipark.org.tr/ (Accessed: April 2, 2026).</w:t>
       </w:r>
     </w:p>
     <w:p>
@@ -1493,7 +1475,7 @@
         <w:pStyle w:val="ListNumber"/>
       </w:pPr>
       <w:r>
-        <w:t>Mozilla. PDF.js. https://mozilla.github.io/pdf.js/</w:t>
+        <w:t>Mozilla. *PDF.js*. Available at: https://mozilla.github.io/pdf.js/ (Accessed: April 2, 2026).</w:t>
       </w:r>
     </w:p>
     <w:p>
@@ -1501,7 +1483,7 @@
         <w:pStyle w:val="ListNumber"/>
       </w:pPr>
       <w:r>
-        <w:t>React Documentation. https://react.dev/</w:t>
+        <w:t>React. *React Documentation*. Available at: https://react.dev/ (Accessed: April 2, 2026).</w:t>
       </w:r>
     </w:p>
     <w:p>
@@ -1509,7 +1491,7 @@
         <w:pStyle w:val="ListNumber"/>
       </w:pPr>
       <w:r>
-        <w:t>Supabase Documentation. https://supabase.com/docs</w:t>
+        <w:t>Supabase. *Supabase Documentation*. Available at: https://supabase.com/docs (Accessed: April 2, 2026).</w:t>
       </w:r>
     </w:p>
     <w:sectPr>

</xml_diff>

<commit_message>
Remove internal script names from defense report
</commit_message>
<xml_diff>
--- a/docs/defense/docx/3_Sinif_Proje_Raporu_YAZILIM_KTUN_EN.docx
+++ b/docs/defense/docx/3_Sinif_Proje_Raporu_YAZILIM_KTUN_EN.docx
@@ -1352,16 +1352,7 @@
     </w:p>
     <w:p>
       <w:r>
-        <w:t xml:space="preserve">The </w:t>
-      </w:r>
-      <w:r>
-        <w:rPr>
-          <w:rFonts w:ascii="Courier New" w:hAnsi="Courier New" w:eastAsia="Courier New"/>
-        </w:rPr>
-        <w:t>feedback/update_terms.py</w:t>
-      </w:r>
-      <w:r>
-        <w:t xml:space="preserve"> script reads user-created event records and turns them into learning signals. Cases with meaningful saved data are treated as positive. Papers that clearly contain no relevant data or are repeatedly skipped are treated as negative. Mixed cases are kept out of training.</w:t>
+        <w:t>The feedback update script reads user-created event records and turns them into learning signals. Cases with meaningful saved data are treated as positive. Papers that clearly contain no relevant data or are repeatedly skipped are treated as negative. Mixed cases are kept out of training.</w:t>
       </w:r>
     </w:p>
     <w:p>
@@ -1371,16 +1362,7 @@
     </w:p>
     <w:p>
       <w:r>
-        <w:t xml:space="preserve">When the end-user paper pool becomes too small, </w:t>
-      </w:r>
-      <w:r>
-        <w:rPr>
-          <w:rFonts w:ascii="Courier New" w:hAnsi="Courier New" w:eastAsia="Courier New"/>
-        </w:rPr>
-        <w:t>ensure_paper_stock.py</w:t>
-      </w:r>
-      <w:r>
-        <w:t xml:space="preserve"> takes over. This script checks the current EN/TR paper counts, refreshes feedback when needed, refreshes the DergiPark index, runs the crawler, and uploads the results to Supabase. That creates an operational bridge between the annotation interface and the data-acquisition layer.</w:t>
+        <w:t>When the end-user paper pool becomes too small, the paper-stock refill script takes over. This script checks the current EN/TR paper counts, refreshes feedback when needed, refreshes the DergiPark index, runs the crawler, and uploads the results to Supabase. That creates an operational bridge between the annotation interface and the data-acquisition layer.</w:t>
       </w:r>
     </w:p>
     <w:p>

</xml_diff>

<commit_message>
Tighten defense report academic presentation
</commit_message>
<xml_diff>
--- a/docs/defense/docx/3_Sinif_Proje_Raporu_YAZILIM_KTUN_EN.docx
+++ b/docs/defense/docx/3_Sinif_Proje_Raporu_YAZILIM_KTUN_EN.docx
@@ -124,25 +124,7 @@
     </w:p>
     <w:p>
       <w:r>
-        <w:t xml:space="preserve">By the midterm stage, OpenNutri has a working core system. The crawler collects metadata from Europe PMC, OpenAlex, Semantic Scholar, and DergiPark; applies search gate and metadata filter steps; imports suitable PDFs into the Supabase layer; and hands those papers to the annotator interface. The annotator opens the paper on top of the PDF, stores food and nutrient entries, and turns user decisions into feedback through </w:t>
-      </w:r>
-      <w:r>
-        <w:rPr>
-          <w:rFonts w:ascii="Courier New" w:hAnsi="Courier New" w:eastAsia="Courier New"/>
-        </w:rPr>
-        <w:t>paper_label_events</w:t>
-      </w:r>
-      <w:r>
-        <w:t xml:space="preserve"> and </w:t>
-      </w:r>
-      <w:r>
-        <w:rPr>
-          <w:rFonts w:ascii="Courier New" w:hAnsi="Courier New" w:eastAsia="Courier New"/>
-        </w:rPr>
-        <w:t>paper_global_labels</w:t>
-      </w:r>
-      <w:r>
-        <w:t>.</w:t>
+        <w:t>By the midterm stage, OpenNutri has a working core system. The crawler collects metadata from Europe PMC, OpenAlex, Semantic Scholar, and DergiPark; applies search gate and metadata filter steps; imports suitable PDFs into the Supabase layer; and hands those papers to the annotator interface. The annotator opens the paper on top of the PDF, stores food and nutrient entries, and turns user decisions into feedback through event and global-label records.</w:t>
       </w:r>
     </w:p>
     <w:p>
@@ -568,7 +550,7 @@
         <w:pStyle w:val="Heading1"/>
       </w:pPr>
       <w:r>
-        <w:t>PROJECT OBJECTIVE and IMPORTANCE</w:t>
+        <w:t>PROJECT OBJECTIVE AND IMPORTANCE</w:t>
       </w:r>
     </w:p>
     <w:p>
@@ -669,30 +651,12 @@
     </w:p>
     <w:p>
       <w:r>
-        <w:t>OpenNutri’s data model is built around a shared vocabulary. FoodData Central [1] and the FAO/INFOODS matching approach [2] were reviewed, and canonical foods and canonical nutrients were modeled as separate tables. As a result, the food and nutrient choices in the UI and the terms used by the crawler rely on the same vocabulary.</w:t>
+        <w:t>OpenNutri’s data model is built around a shared vocabulary. FoodData Central [1] and the FAO/INFOODS matching approach [2] were reviewed, and canonical foods and canonical nutrients were treated as separate concepts. This supports the use of the same vocabulary across annotation and retrieval tasks.</w:t>
       </w:r>
     </w:p>
     <w:p>
       <w:r>
-        <w:t xml:space="preserve">Ontology-centered work such as FoodOn [3] is relevant for standardizing food names. The </w:t>
-      </w:r>
-      <w:r>
-        <w:rPr>
-          <w:rFonts w:ascii="Courier New" w:hAnsi="Courier New" w:eastAsia="Courier New"/>
-        </w:rPr>
-        <w:t>entities</w:t>
-      </w:r>
-      <w:r>
-        <w:t xml:space="preserve"> and </w:t>
-      </w:r>
-      <w:r>
-        <w:rPr>
-          <w:rFonts w:ascii="Courier New" w:hAnsi="Courier New" w:eastAsia="Courier New"/>
-        </w:rPr>
-        <w:t>entity_aliases</w:t>
-      </w:r>
-      <w:r>
-        <w:t xml:space="preserve"> structure was chosen for the same standardization need.</w:t>
+        <w:t>Ontology-centered work such as FoodOn [3] is relevant for standardizing food names. Such ontologies make clear why different names from different sources must be mapped onto shared concepts.</w:t>
       </w:r>
     </w:p>
     <w:p>
@@ -705,7 +669,7 @@
     </w:p>
     <w:p>
       <w:r>
-        <w:t>PubMed Central [4] and Europe PMC [5] were evaluated as core external sources because they provide structured access to open-access biomedical and life-science literature. DergiPark [6] was included specifically to reach Turkish-language studies. During the midterm period, the DergiPark path was redesigned from a simple broad search approach into a renewable local journal/issue/article index. That change made Turkish-language crawling more controlled and auditable.</w:t>
+        <w:t>PubMed Central [4] and Europe PMC [5] were evaluated as core external sources because they provide structured access to open-access biomedical and life-science literature. DergiPark [6] is especially important for reaching Turkish-language studies. Taken together, these sources show the need to handle international and local literature in the same system while respecting different language and source characteristics.</w:t>
       </w:r>
     </w:p>
     <w:p>
@@ -718,52 +682,7 @@
     </w:p>
     <w:p>
       <w:r>
-        <w:t xml:space="preserve">Human-in-the-loop methodology [7] keeps the expert user as an active part of extraction and verification. In OpenNutri, this approach is implemented through the annotator UI and </w:t>
-      </w:r>
-      <w:r>
-        <w:rPr>
-          <w:rFonts w:ascii="Courier New" w:hAnsi="Courier New" w:eastAsia="Courier New"/>
-        </w:rPr>
-        <w:t>paper_label_events</w:t>
-      </w:r>
-      <w:r>
-        <w:t xml:space="preserve">. User actions such as </w:t>
-      </w:r>
-      <w:r>
-        <w:rPr>
-          <w:rFonts w:ascii="Courier New" w:hAnsi="Courier New" w:eastAsia="Courier New"/>
-        </w:rPr>
-        <w:t>draft</w:t>
-      </w:r>
-      <w:r>
-        <w:t xml:space="preserve">, </w:t>
-      </w:r>
-      <w:r>
-        <w:rPr>
-          <w:rFonts w:ascii="Courier New" w:hAnsi="Courier New" w:eastAsia="Courier New"/>
-        </w:rPr>
-        <w:t>done</w:t>
-      </w:r>
-      <w:r>
-        <w:t xml:space="preserve">, </w:t>
-      </w:r>
-      <w:r>
-        <w:rPr>
-          <w:rFonts w:ascii="Courier New" w:hAnsi="Courier New" w:eastAsia="Courier New"/>
-        </w:rPr>
-        <w:t>skipped</w:t>
-      </w:r>
-      <w:r>
-        <w:t xml:space="preserve">, and global </w:t>
-      </w:r>
-      <w:r>
-        <w:rPr>
-          <w:rFonts w:ascii="Courier New" w:hAnsi="Courier New" w:eastAsia="Courier New"/>
-        </w:rPr>
-        <w:t>definitely_no_data</w:t>
-      </w:r>
-      <w:r>
-        <w:t xml:space="preserve"> directly become crawler feedback.</w:t>
+        <w:t>Human-in-the-loop methodology [7] keeps the expert user as an active part of extraction and verification. It supports treating expert decisions not only as final labels but also as feedback signals that can be reused later.</w:t>
       </w:r>
     </w:p>
     <w:p>
@@ -776,7 +695,7 @@
     </w:p>
     <w:p>
       <w:r>
-        <w:t>Because article content is usually distributed as PDF, in-browser PDF processing became essential. PDF.js [8] and React [9] were evaluated together. The nutrient-highlighting feature required extra scanning logic because the PDF text layer is fragmented across spans.</w:t>
+        <w:t>Because article content is usually distributed as PDF, in-browser PDF processing became essential. PDF.js [8] and React [9] were evaluated together. In literature-annotation settings, the fragmented PDF text layer makes highlighting, selection, and text matching important problems in addition to basic rendering.</w:t>
       </w:r>
     </w:p>
     <w:p>
@@ -789,12 +708,12 @@
     </w:p>
     <w:p>
       <w:r>
-        <w:t>Supabase [10] was selected because it combines authentication, row-level access control, file storage, and client access in one platform. At the midterm stage, both the annotator and the data pipeline already share this backend.</w:t>
+        <w:t>Supabase [10] was evaluated because it combines authentication, row-level access control, file storage, and client access in one platform. Platforms of this kind are suitable for systems where the user interface and the data pipeline share the same backend.</w:t>
       </w:r>
     </w:p>
     <w:p>
       <w:r>
-        <w:t>Taken together, this literature and platform review explains why the project uses a shared vocabulary, multi-source access, expert annotation on top of PDFs, and a human-in-the-loop verification model.</w:t>
+        <w:t>Taken together, this literature and platform review explains why the problem domain calls for a shared vocabulary, multi-source access, expert annotation on top of PDFs, and a human-in-the-loop verification model.</w:t>
       </w:r>
     </w:p>
     <w:p>
@@ -1255,16 +1174,7 @@
     </w:p>
     <w:p>
       <w:r>
-        <w:t xml:space="preserve">Figure 5. Before final submission, this visual should be replaced with a real screenshot of the current annotator interface. The simplest approach is to replace </w:t>
-      </w:r>
-      <w:r>
-        <w:rPr>
-          <w:rFonts w:ascii="Courier New" w:hAnsi="Courier New" w:eastAsia="Courier New"/>
-        </w:rPr>
-        <w:t>docs/defense/assets/figure_5_annotator_placeholder_en.png</w:t>
-      </w:r>
-      <w:r>
-        <w:t xml:space="preserve"> with the screenshot under the same filename and rerun the export script. The image should include the PDF viewer, an example highlighted nutrient, the food-item form, and the progress/status area in the same frame.</w:t>
+        <w:t>Figure 5. Before final submission, this visual should be replaced with a real screenshot of the current annotator interface. The image should include the PDF viewer, an example highlighted nutrient, the food-item form, and the progress/status area in the same frame.</w:t>
       </w:r>
     </w:p>
     <w:p>

</xml_diff>

<commit_message>
Apply final defense report wording fixes
</commit_message>
<xml_diff>
--- a/docs/defense/docx/3_Sinif_Proje_Raporu_YAZILIM_KTUN_EN.docx
+++ b/docs/defense/docx/3_Sinif_Proje_Raporu_YAZILIM_KTUN_EN.docx
@@ -610,7 +610,7 @@
     </w:p>
     <w:p>
       <w:r>
-        <w:t>This need is sharper for Turkish literature. Many studies published in Turkey remain inside DergiPark and similar archives without becoming part of standard international food-data infrastructure. As a result, local foods, local varieties, and Turkish-language studies lose digital visibility. The EN/TR workflow split is therefore a scope decision with direct technical consequences.</w:t>
+        <w:t>This need is especially visible in Turkish literature. Many studies published in Turkey remain inside DergiPark and similar archives without becoming part of standard international food-data infrastructure. As a result, local foods, local varieties, and Turkish-language studies remain underrepresented in digital food-data infrastructure. The EN/TR workflow split is therefore a scope decision with direct technical consequences.</w:t>
       </w:r>
     </w:p>
     <w:p>
@@ -1067,16 +1067,7 @@
         <w:pStyle w:val="ListBullet"/>
       </w:pPr>
       <w:r>
-        <w:t xml:space="preserve">counting valid food items to prevent empty placeholder cards from inflating </w:t>
-      </w:r>
-      <w:r>
-        <w:rPr>
-          <w:rFonts w:ascii="Courier New" w:hAnsi="Courier New" w:eastAsia="Courier New"/>
-        </w:rPr>
-        <w:t>food_item_count</w:t>
-      </w:r>
-      <w:r>
-        <w:t>.</w:t>
+        <w:t>counting only valid food items so empty placeholder cards do not affect saved totals.</w:t>
       </w:r>
     </w:p>
     <w:p>
@@ -1285,7 +1276,7 @@
     </w:p>
     <w:p>
       <w:r>
-        <w:t>This report focuses on the first three working semester goals and the data/feedback infrastructure supporting them. Document segmentation and the LLM-based extraction process belong to the next phase.</w:t>
+        <w:t>This report focuses on the first three working semester goals and the data/feedback infrastructure supporting them. Document segmentation and the LLM-based extraction process are deferred to the second semester.</w:t>
       </w:r>
     </w:p>
     <w:p>

</xml_diff>

<commit_message>
Polish midterm report structure and figure flow
</commit_message>
<xml_diff>
--- a/docs/defense/docx/3_Sinif_Proje_Raporu_YAZILIM_KTUN_EN.docx
+++ b/docs/defense/docx/3_Sinif_Proje_Raporu_YAZILIM_KTUN_EN.docx
@@ -124,7 +124,7 @@
     </w:p>
     <w:p>
       <w:r>
-        <w:t>By the midterm stage, OpenNutri has a working core system. The crawler collects metadata from Europe PMC, OpenAlex, Semantic Scholar, and DergiPark; applies search gate and metadata filter steps; imports suitable PDFs into the Supabase layer; and hands those papers to the annotator interface. The annotator opens the paper on top of the PDF, stores food and nutrient entries, and turns user decisions into feedback through event and global-label records.</w:t>
+        <w:t>By the midterm stage, OpenNutri has a working core system. The crawler collects metadata from Europe PMC, OpenAlex, Semantic Scholar, and DergiPark; passes candidates through staged relevance checks; imports suitable PDFs into the Supabase layer; and hands those papers to the annotator interface. The annotator opens the paper on top of the PDF, stores food-item and nutrient entries, and turns user decisions into feedback signals for later runs.</w:t>
       </w:r>
     </w:p>
     <w:p>
@@ -488,7 +488,7 @@
     </w:tbl>
     <w:p>
       <w:r>
-        <w:t>Figure 1 shows the end-to-end system state available at the midterm stage.</w:t>
+        <w:t>The main purpose of Figure 1 is to show that the midterm system is not a loose set of tools, but a closed operational loop.</w:t>
       </w:r>
     </w:p>
     <w:p>
@@ -768,12 +768,12 @@
     </w:p>
     <w:p>
       <w:r>
-        <w:t>Four engineering choices define the current implementation: separating paper discovery from PDF acquisition, using a shared vocabulary and shared database, building annotation around a dynamic row model, and storing user decisions as event-based feedback. The following subsections describe how those choices are implemented.</w:t>
+        <w:t>Four engineering choices define the current implementation: separating paper discovery from PDF acquisition, using a shared vocabulary and shared database, building annotation around a dynamic row model, and storing user decisions as event-based feedback. The following subsections focus on how that structure works rather than listing tools in isolation.</w:t>
       </w:r>
     </w:p>
     <w:p>
       <w:r>
-        <w:t>The interaction of these layers was shown in Figure 1. Figure 2 expands that view by focusing on the internal data-model and feedback relationships.</w:t>
+        <w:t>The interaction of these layers was shown in Figure 1. Figure 2 makes one point more explicit: annotation data is not a side product that sits apart from feedback, but part of the same internal data model.</w:t>
       </w:r>
     </w:p>
     <w:p>
@@ -830,125 +830,12 @@
     </w:p>
     <w:p>
       <w:r>
-        <w:t>The main technical materials used in the project are:</w:t>
-      </w:r>
-    </w:p>
-    <w:p>
-      <w:pPr>
-        <w:pStyle w:val="ListBullet"/>
-      </w:pPr>
-      <w:r>
-        <w:rPr>
-          <w:b/>
-        </w:rPr>
-        <w:t>Frontend framework:</w:t>
-      </w:r>
-      <w:r>
-        <w:t xml:space="preserve"> React 19 + Vite</w:t>
-      </w:r>
-    </w:p>
-    <w:p>
-      <w:pPr>
-        <w:pStyle w:val="ListBullet"/>
-      </w:pPr>
-      <w:r>
-        <w:rPr>
-          <w:b/>
-        </w:rPr>
-        <w:t>Backend and storage:</w:t>
-      </w:r>
-      <w:r>
-        <w:t xml:space="preserve"> Supabase Auth, PostgreSQL, Storage</w:t>
-      </w:r>
-    </w:p>
-    <w:p>
-      <w:pPr>
-        <w:pStyle w:val="ListBullet"/>
-      </w:pPr>
-      <w:r>
-        <w:rPr>
-          <w:b/>
-        </w:rPr>
-        <w:t>PDF handling:</w:t>
-      </w:r>
-      <w:r>
-        <w:t xml:space="preserve"> </w:t>
-      </w:r>
-      <w:r>
-        <w:rPr>
-          <w:rFonts w:ascii="Courier New" w:hAnsi="Courier New" w:eastAsia="Courier New"/>
-        </w:rPr>
-        <w:t>react-pdf</w:t>
-      </w:r>
-      <w:r>
-        <w:t xml:space="preserve"> and PDF.js</w:t>
-      </w:r>
-    </w:p>
-    <w:p>
-      <w:pPr>
-        <w:pStyle w:val="ListBullet"/>
-      </w:pPr>
-      <w:r>
-        <w:rPr>
-          <w:b/>
-        </w:rPr>
-        <w:t>Data-pipeline language:</w:t>
-      </w:r>
-      <w:r>
-        <w:t xml:space="preserve"> Python</w:t>
-      </w:r>
-    </w:p>
-    <w:p>
-      <w:pPr>
-        <w:pStyle w:val="ListBullet"/>
-      </w:pPr>
-      <w:r>
-        <w:rPr>
-          <w:b/>
-        </w:rPr>
-        <w:t>Reference data source:</w:t>
-      </w:r>
-      <w:r>
-        <w:t xml:space="preserve"> USDA FoodData Central [1]</w:t>
-      </w:r>
-    </w:p>
-    <w:p>
-      <w:pPr>
-        <w:pStyle w:val="ListBullet"/>
-      </w:pPr>
-      <w:r>
-        <w:rPr>
-          <w:b/>
-        </w:rPr>
-        <w:t>Paper sources:</w:t>
-      </w:r>
-      <w:r>
-        <w:t xml:space="preserve"> Europe PMC [5], PubMed Central [4], OpenAlex, Semantic Scholar, DergiPark [6]</w:t>
-      </w:r>
-    </w:p>
-    <w:p>
-      <w:pPr>
-        <w:pStyle w:val="ListBullet"/>
-      </w:pPr>
-      <w:r>
-        <w:rPr>
-          <w:b/>
-        </w:rPr>
-        <w:t>Embedding layer:</w:t>
-      </w:r>
-      <w:r>
-        <w:t xml:space="preserve"> a dual English + multilingual setup based on </w:t>
-      </w:r>
-      <w:r>
-        <w:rPr>
-          <w:rFonts w:ascii="Courier New" w:hAnsi="Courier New" w:eastAsia="Courier New"/>
-        </w:rPr>
-        <w:t>sentence-transformers</w:t>
+        <w:t>This version is built around two connected technical clusters. On the user side, a React 19 + Vite web interface works together with PDF.js and react-pdf so that PDF viewing, highlighting, and structured entry happen on the same screen. On the backend side, Supabase brings authentication, PostgreSQL, and file storage into the same application layer.</w:t>
       </w:r>
     </w:p>
     <w:p>
       <w:r>
-        <w:t>These components are used across two connected sides of the project: the web application that manages expert workflow and the data pipeline that feeds the paper queue.</w:t>
+        <w:t>The acquisition and feedback pipeline is implemented in Python. Europe PMC, PubMed Central, OpenAlex, Semantic Scholar, and DergiPark are used as paper sources, while USDA FoodData Central [1] is used as the reference data source. Metadata-level semantic suitability is supported by a dual English + multilingual embedding setup based on sentence-transformers.</w:t>
       </w:r>
     </w:p>
     <w:p>
@@ -971,7 +858,7 @@
     </w:p>
     <w:p>
       <w:r>
-        <w:t>Figure 3 presents a simplified database summary derived from the database migration script that defines the active Supabase schema.</w:t>
+        <w:t>Figure 3 highlights that the database is not only a storage layer, but the shared contract that links the main system components.</w:t>
       </w:r>
     </w:p>
     <w:p>
@@ -1015,7 +902,7 @@
     </w:p>
     <w:p>
       <w:r>
-        <w:t>Figure 3. Simplified view of the main database structure used in the midterm system, grouped into four responsibilities so the project is easier to understand. The summary is derived from the database migration script.</w:t>
+        <w:t>Figure 3. Simplified view of the main database structure used in the midterm system, grouped into four responsibilities so the project is easier to understand. The summary is derived from the active Supabase schema.</w:t>
       </w:r>
     </w:p>
     <w:p>
@@ -1051,7 +938,16 @@
         <w:pStyle w:val="ListBullet"/>
       </w:pPr>
       <w:r>
-        <w:t>a test mode that allows safe use of the full UI without writing to the real database,</w:t>
+        <w:t xml:space="preserve">a </w:t>
+      </w:r>
+      <w:r>
+        <w:rPr>
+          <w:rFonts w:ascii="Courier New" w:hAnsi="Courier New" w:eastAsia="Courier New"/>
+        </w:rPr>
+        <w:t>test mode</w:t>
+      </w:r>
+      <w:r>
+        <w:t xml:space="preserve"> that allows safe use of the full UI without writing to the real database,</w:t>
       </w:r>
     </w:p>
     <w:p>
@@ -1059,7 +955,16 @@
         <w:pStyle w:val="ListBullet"/>
       </w:pPr>
       <w:r>
-        <w:t>a global "definitely no data" action with a short undo window,</w:t>
+        <w:t xml:space="preserve">a </w:t>
+      </w:r>
+      <w:r>
+        <w:rPr>
+          <w:rFonts w:ascii="Courier New" w:hAnsi="Courier New" w:eastAsia="Courier New"/>
+        </w:rPr>
+        <w:t>global skip</w:t>
+      </w:r>
+      <w:r>
+        <w:t xml:space="preserve"> action that marks a paper as containing no relevant data for all users, with a short undo window,</w:t>
       </w:r>
     </w:p>
     <w:p>
@@ -1072,56 +977,7 @@
     </w:p>
     <w:p>
       <w:r>
-        <w:t>Figure 4 shows the numeric summary produced by the crawler's staged flow.</w:t>
-      </w:r>
-    </w:p>
-    <w:p>
-      <w:pPr>
-        <w:jc w:val="center"/>
-      </w:pPr>
-      <w:r>
-        <w:drawing>
-          <wp:inline xmlns:a="http://schemas.openxmlformats.org/drawingml/2006/main" xmlns:pic="http://schemas.openxmlformats.org/drawingml/2006/picture">
-            <wp:extent cx="5669280" cy="3099168"/>
-            <wp:docPr id="4" name="Picture 4"/>
-            <wp:cNvGraphicFramePr>
-              <a:graphicFrameLocks noChangeAspect="1"/>
-            </wp:cNvGraphicFramePr>
-            <a:graphic>
-              <a:graphicData uri="http://schemas.openxmlformats.org/drawingml/2006/picture">
-                <pic:pic>
-                  <pic:nvPicPr>
-                    <pic:cNvPr id="0" name="figure_4_crawler_funnel_example_en.png"/>
-                    <pic:cNvPicPr/>
-                  </pic:nvPicPr>
-                  <pic:blipFill>
-                    <a:blip r:embed="rId12"/>
-                    <a:stretch>
-                      <a:fillRect/>
-                    </a:stretch>
-                  </pic:blipFill>
-                  <pic:spPr>
-                    <a:xfrm>
-                      <a:off x="0" y="0"/>
-                      <a:ext cx="5669280" cy="3099168"/>
-                    </a:xfrm>
-                    <a:prstGeom prst="rect"/>
-                  </pic:spPr>
-                </pic:pic>
-              </a:graphicData>
-            </a:graphic>
-          </wp:inline>
-        </w:drawing>
-      </w:r>
-    </w:p>
-    <w:p>
-      <w:r>
-        <w:t>Figure 4. Stage counts derived from the manifest summary of a representative Turkish live run.</w:t>
-      </w:r>
-    </w:p>
-    <w:p>
-      <w:r>
-        <w:t>Figure 5 is the placeholder for the final annotator UI screenshot.</w:t>
+        <w:t>The point of Figure 4 is to make the annotator work pattern concrete: document reading and structured entry happen in the same interface.</w:t>
       </w:r>
     </w:p>
     <w:p>
@@ -1132,7 +988,7 @@
         <w:drawing>
           <wp:inline xmlns:a="http://schemas.openxmlformats.org/drawingml/2006/main" xmlns:pic="http://schemas.openxmlformats.org/drawingml/2006/picture">
             <wp:extent cx="5669280" cy="3130743"/>
-            <wp:docPr id="5" name="Picture 5"/>
+            <wp:docPr id="4" name="Picture 4"/>
             <wp:cNvGraphicFramePr>
               <a:graphicFrameLocks noChangeAspect="1"/>
             </wp:cNvGraphicFramePr>
@@ -1140,11 +996,11 @@
               <a:graphicData uri="http://schemas.openxmlformats.org/drawingml/2006/picture">
                 <pic:pic>
                   <pic:nvPicPr>
-                    <pic:cNvPr id="0" name="figure_5_annotator_placeholder_en.png"/>
+                    <pic:cNvPr id="0" name="figure_4_annotator_placeholder_en.png"/>
                     <pic:cNvPicPr/>
                   </pic:nvPicPr>
                   <pic:blipFill>
-                    <a:blip r:embed="rId13"/>
+                    <a:blip r:embed="rId12"/>
                     <a:stretch>
                       <a:fillRect/>
                     </a:stretch>
@@ -1165,7 +1021,7 @@
     </w:p>
     <w:p>
       <w:r>
-        <w:t>Figure 5. Before final submission, this visual should be replaced with a real screenshot of the current annotator interface. The image should include the PDF viewer, an example highlighted nutrient, the food-item form, and the progress/status area in the same frame.</w:t>
+        <w:t>Figure 4. Before final submission, this visual should be replaced with a real screenshot of the current annotator interface. The image should include the PDF viewer, an example highlighted nutrient, the food-item form, and the progress/status area in the same frame.</w:t>
       </w:r>
     </w:p>
     <w:p>
@@ -1206,7 +1062,25 @@
         <w:t>Filter:</w:t>
       </w:r>
       <w:r>
-        <w:t xml:space="preserve"> applying search-gate and metadata-filter logic to titles and abstracts</w:t>
+        <w:t xml:space="preserve"> applying a </w:t>
+      </w:r>
+      <w:r>
+        <w:rPr>
+          <w:rFonts w:ascii="Courier New" w:hAnsi="Courier New" w:eastAsia="Courier New"/>
+        </w:rPr>
+        <w:t>search gate</w:t>
+      </w:r>
+      <w:r>
+        <w:t xml:space="preserve">, meaning the first eligibility threshold, and a </w:t>
+      </w:r>
+      <w:r>
+        <w:rPr>
+          <w:rFonts w:ascii="Courier New" w:hAnsi="Courier New" w:eastAsia="Courier New"/>
+        </w:rPr>
+        <w:t>metadata filter</w:t>
+      </w:r>
+      <w:r>
+        <w:t>, meaning the more detailed relevance screen over titles and abstracts</w:t>
       </w:r>
     </w:p>
     <w:p>
@@ -1235,7 +1109,65 @@
     </w:p>
     <w:p>
       <w:r>
-        <w:t>Two crawler capabilities are especially important at this stage: separate target pools for English and Turkish literature, and feedback reuse at both term and query-batch level.</w:t>
+        <w:t xml:space="preserve">Two crawler capabilities are especially important at this stage: separate target pools for English and Turkish literature, and feedback reuse at both term and </w:t>
+      </w:r>
+      <w:r>
+        <w:rPr>
+          <w:rFonts w:ascii="Courier New" w:hAnsi="Courier New" w:eastAsia="Courier New"/>
+        </w:rPr>
+        <w:t>query batch</w:t>
+      </w:r>
+      <w:r>
+        <w:t xml:space="preserve"> level, where a query batch is a bounded search run executed under the same query composition.</w:t>
+      </w:r>
+    </w:p>
+    <w:p>
+      <w:r>
+        <w:t>Figure 5 shows that the staged crawler design is not only conceptual; its effect can also be tracked numerically in run summaries.</w:t>
+      </w:r>
+    </w:p>
+    <w:p>
+      <w:pPr>
+        <w:jc w:val="center"/>
+      </w:pPr>
+      <w:r>
+        <w:drawing>
+          <wp:inline xmlns:a="http://schemas.openxmlformats.org/drawingml/2006/main" xmlns:pic="http://schemas.openxmlformats.org/drawingml/2006/picture">
+            <wp:extent cx="5669280" cy="3099168"/>
+            <wp:docPr id="5" name="Picture 5"/>
+            <wp:cNvGraphicFramePr>
+              <a:graphicFrameLocks noChangeAspect="1"/>
+            </wp:cNvGraphicFramePr>
+            <a:graphic>
+              <a:graphicData uri="http://schemas.openxmlformats.org/drawingml/2006/picture">
+                <pic:pic>
+                  <pic:nvPicPr>
+                    <pic:cNvPr id="0" name="figure_4_crawler_funnel_example_en.png"/>
+                    <pic:cNvPicPr/>
+                  </pic:nvPicPr>
+                  <pic:blipFill>
+                    <a:blip r:embed="rId13"/>
+                    <a:stretch>
+                      <a:fillRect/>
+                    </a:stretch>
+                  </pic:blipFill>
+                  <pic:spPr>
+                    <a:xfrm>
+                      <a:off x="0" y="0"/>
+                      <a:ext cx="5669280" cy="3099168"/>
+                    </a:xfrm>
+                    <a:prstGeom prst="rect"/>
+                  </pic:spPr>
+                </pic:pic>
+              </a:graphicData>
+            </a:graphic>
+          </wp:inline>
+        </w:drawing>
+      </w:r>
+    </w:p>
+    <w:p>
+      <w:r>
+        <w:t>Figure 5. Stage counts derived from the manifest summary of a representative Turkish live run.</w:t>
       </w:r>
     </w:p>
     <w:p>
@@ -1253,7 +1185,16 @@
     </w:p>
     <w:p>
       <w:r>
-        <w:t>The feedback update script reads user-created event records and turns them into learning signals. Cases with meaningful saved data are treated as positive. Papers that clearly contain no relevant data or are repeatedly skipped are treated as negative. Mixed cases are kept out of training.</w:t>
+        <w:t xml:space="preserve">The feedback update script reads the </w:t>
+      </w:r>
+      <w:r>
+        <w:rPr>
+          <w:rFonts w:ascii="Courier New" w:hAnsi="Courier New" w:eastAsia="Courier New"/>
+        </w:rPr>
+        <w:t>event log</w:t>
+      </w:r>
+      <w:r>
+        <w:t>, the chronological record of save and skip decisions, and turns it into learning signals. Cases with meaningful saved data are treated as positive. Papers that clearly contain no relevant data or are repeatedly skipped are treated as negative. Mixed cases are kept out of training.</w:t>
       </w:r>
     </w:p>
     <w:p>
@@ -1271,7 +1212,7 @@
         <w:pStyle w:val="Heading2"/>
       </w:pPr>
       <w:r>
-        <w:t>7. Current limitations</w:t>
+        <w:t>7. Midterm scope boundary</w:t>
       </w:r>
     </w:p>
     <w:p>

</xml_diff>

<commit_message>
Simplify figure references in midterm report
</commit_message>
<xml_diff>
--- a/docs/defense/docx/3_Sinif_Proje_Raporu_YAZILIM_KTUN_EN.docx
+++ b/docs/defense/docx/3_Sinif_Proje_Raporu_YAZILIM_KTUN_EN.docx
@@ -488,7 +488,7 @@
     </w:tbl>
     <w:p>
       <w:r>
-        <w:t>The main purpose of Figure 1 is to show that the midterm system is not a loose set of tools, but a closed operational loop.</w:t>
+        <w:t>Figure 1 shows the end-to-end system state available at the midterm stage.</w:t>
       </w:r>
     </w:p>
     <w:p>
@@ -773,7 +773,7 @@
     </w:p>
     <w:p>
       <w:r>
-        <w:t>The interaction of these layers was shown in Figure 1. Figure 2 makes one point more explicit: annotation data is not a side product that sits apart from feedback, but part of the same internal data model.</w:t>
+        <w:t>The interaction of these layers was shown in Figure 1. Figure 2 expands that view by focusing on the internal data-model and feedback relationships.</w:t>
       </w:r>
     </w:p>
     <w:p>
@@ -858,7 +858,7 @@
     </w:p>
     <w:p>
       <w:r>
-        <w:t>Figure 3 highlights that the database is not only a storage layer, but the shared contract that links the main system components.</w:t>
+        <w:t>Figure 3 presents a simplified database summary derived from the active Supabase schema.</w:t>
       </w:r>
     </w:p>
     <w:p>
@@ -977,7 +977,7 @@
     </w:p>
     <w:p>
       <w:r>
-        <w:t>The point of Figure 4 is to make the annotator work pattern concrete: document reading and structured entry happen in the same interface.</w:t>
+        <w:t>Figure 4 is the placeholder for the final annotator UI screenshot.</w:t>
       </w:r>
     </w:p>
     <w:p>
@@ -1123,7 +1123,7 @@
     </w:p>
     <w:p>
       <w:r>
-        <w:t>Figure 5 shows that the staged crawler design is not only conceptual; its effect can also be tracked numerically in run summaries.</w:t>
+        <w:t>Figure 5 shows the numeric summary produced by the crawler's staged flow.</w:t>
       </w:r>
     </w:p>
     <w:p>

</xml_diff>

<commit_message>
Tighten final midterm report wording
</commit_message>
<xml_diff>
--- a/docs/defense/docx/3_Sinif_Proje_Raporu_YAZILIM_KTUN_EN.docx
+++ b/docs/defense/docx/3_Sinif_Proje_Raporu_YAZILIM_KTUN_EN.docx
@@ -610,7 +610,7 @@
     </w:p>
     <w:p>
       <w:r>
-        <w:t>This need is especially visible in Turkish literature. Many studies published in Turkey remain inside DergiPark and similar archives without becoming part of standard international food-data infrastructure. As a result, local foods, local varieties, and Turkish-language studies remain underrepresented in digital food-data infrastructure. The EN/TR workflow split is therefore a scope decision with direct technical consequences.</w:t>
+        <w:t>This need is especially visible in Turkish literature. Many studies published in Turkey remain inside DergiPark and similar archives without becoming part of standard international food-data infrastructure. As a result, local foods, local varieties, and Turkish-language studies remain underrepresented in those systems. The EN/TR workflow split is therefore a scope decision with direct technical consequences.</w:t>
       </w:r>
     </w:p>
     <w:p>
@@ -1194,12 +1194,7 @@
         <w:t>event log</w:t>
       </w:r>
       <w:r>
-        <w:t>, the chronological record of save and skip decisions, and turns it into learning signals. Cases with meaningful saved data are treated as positive. Papers that clearly contain no relevant data or are repeatedly skipped are treated as negative. Mixed cases are kept out of training.</w:t>
-      </w:r>
-    </w:p>
-    <w:p>
-      <w:r>
-        <w:t>User decisions are reused as soft scoring signals in later crawler runs.</w:t>
+        <w:t>, the chronological record of save and skip decisions, and turns it into learning signals. Cases with meaningful saved data are treated as positive. Papers that clearly contain no relevant data or are repeatedly skipped are treated as negative. Mixed cases are kept out of training. User decisions are reused as soft scoring signals in later crawler runs.</w:t>
       </w:r>
     </w:p>
     <w:p>

</xml_diff>

<commit_message>
Polish final midterm report style
</commit_message>
<xml_diff>
--- a/docs/defense/docx/3_Sinif_Proje_Raporu_YAZILIM_KTUN_EN.docx
+++ b/docs/defense/docx/3_Sinif_Proje_Raporu_YAZILIM_KTUN_EN.docx
@@ -768,7 +768,7 @@
     </w:p>
     <w:p>
       <w:r>
-        <w:t>Four engineering choices define the current implementation: separating paper discovery from PDF acquisition, using a shared vocabulary and shared database, building annotation around a dynamic row model, and storing user decisions as event-based feedback. The following subsections focus on how that structure works rather than listing tools in isolation.</w:t>
+        <w:t>Four engineering choices define the current implementation: separating paper discovery from PDF acquisition, using a shared vocabulary and shared database, building annotation around a dynamic row model, and storing user decisions as event-based feedback. The following subsections describe how those choices are implemented.</w:t>
       </w:r>
     </w:p>
     <w:p>
@@ -830,7 +830,7 @@
     </w:p>
     <w:p>
       <w:r>
-        <w:t>This version is built around two connected technical clusters. On the user side, a React 19 + Vite web interface works together with PDF.js and react-pdf so that PDF viewing, highlighting, and structured entry happen on the same screen. On the backend side, Supabase brings authentication, PostgreSQL, and file storage into the same application layer.</w:t>
+        <w:t>The midterm system is built around two connected technical clusters. On the user side, a React 19 + Vite web interface works together with PDF.js and react-pdf so that PDF viewing, highlighting, and structured entry happen on the same screen. On the backend side, Supabase brings authentication, PostgreSQL, and file storage into the same application layer.</w:t>
       </w:r>
     </w:p>
     <w:p>

</xml_diff>